<commit_message>
Update MWO Washington forms with latest edits
</commit_message>
<xml_diff>
--- a/forms/washington/01-special-power-of-attorney.docx
+++ b/forms/washington/01-special-power-of-attorney.docx
@@ -1,6 +1,6 @@
 
 <file path=word/document.xml><?xml version="1.0" encoding="utf-8"?>
-<w:document xmlns:mc="http://schemas.openxmlformats.org/markup-compatibility/2006" xmlns:ve="http://schemas.openxmlformats.org/markup-compatibility/2006" xmlns:o="urn:schemas-microsoft-com:office:office" xmlns:r="http://schemas.openxmlformats.org/officeDocument/2006/relationships" xmlns:m="http://schemas.openxmlformats.org/officeDocument/2006/math" xmlns:v="urn:schemas-microsoft-com:vml" xmlns:wp="http://schemas.openxmlformats.org/drawingml/2006/wordprocessingDrawing" xmlns:w10="urn:schemas-microsoft-com:office:word" xmlns:w="http://schemas.openxmlformats.org/wordprocessingml/2006/main" xmlns:wne="http://schemas.microsoft.com/office/word/2006/wordml" xmlns:a="http://schemas.openxmlformats.org/drawingml/2006/main" xmlns:pic="http://schemas.openxmlformats.org/drawingml/2006/picture" xmlns:wpg="http://schemas.microsoft.com/office/word/2010/wordprocessingGroup" xmlns:wps="http://schemas.microsoft.com/office/word/2010/wordprocessingShape" xmlns:w14="http://schemas.microsoft.com/office/word/2010/wordml" mc:Ignorable="w14" xml:space="preserve">
+<w:document xmlns:wpc="http://schemas.microsoft.com/office/word/2010/wordprocessingCanvas" xmlns:cx="http://schemas.microsoft.com/office/drawing/2014/chartex" xmlns:cx1="http://schemas.microsoft.com/office/drawing/2015/9/8/chartex" xmlns:cx2="http://schemas.microsoft.com/office/drawing/2015/10/21/chartex" xmlns:cx3="http://schemas.microsoft.com/office/drawing/2016/5/9/chartex" xmlns:cx4="http://schemas.microsoft.com/office/drawing/2016/5/10/chartex" xmlns:cx5="http://schemas.microsoft.com/office/drawing/2016/5/11/chartex" xmlns:cx6="http://schemas.microsoft.com/office/drawing/2016/5/12/chartex" xmlns:cx7="http://schemas.microsoft.com/office/drawing/2016/5/13/chartex" xmlns:cx8="http://schemas.microsoft.com/office/drawing/2016/5/14/chartex" xmlns:mc="http://schemas.openxmlformats.org/markup-compatibility/2006" xmlns:m="http://schemas.openxmlformats.org/officeDocument/2006/math" xmlns:aink="http://schemas.microsoft.com/office/drawing/2016/ink" xmlns:am3d="http://schemas.microsoft.com/office/drawing/2017/model3d" xmlns:oel="http://schemas.microsoft.com/office/2019/extlst" xmlns:r="http://schemas.openxmlformats.org/officeDocument/2006/relationships" xmlns:wp14="http://schemas.microsoft.com/office/word/2010/wordprocessingDrawing" xmlns:wp="http://schemas.openxmlformats.org/drawingml/2006/wordprocessingDrawing" xmlns:wpg="http://schemas.microsoft.com/office/word/2010/wordprocessingGroup" xmlns:wpi="http://schemas.microsoft.com/office/word/2010/wordprocessingInk" xmlns:wps="http://schemas.microsoft.com/office/word/2010/wordprocessingShape" xmlns:o="urn:schemas-microsoft-com:office:office" xmlns:v="urn:schemas-microsoft-com:vml" xmlns:w10="urn:schemas-microsoft-com:office:word" xmlns:w="http://schemas.openxmlformats.org/wordprocessingml/2006/main" xmlns:w14="http://schemas.microsoft.com/office/word/2010/wordml" xmlns:w15="http://schemas.microsoft.com/office/word/2012/wordml" xmlns:w16cex="http://schemas.microsoft.com/office/word/2018/wordml/cex" xmlns:w16cid="http://schemas.microsoft.com/office/word/2016/wordml/cid" xmlns:w16="http://schemas.microsoft.com/office/word/2018/wordml" xmlns:w16sdtdh="http://schemas.microsoft.com/office/word/2020/wordml/sdtdatahash" xmlns:w16sdtfl="http://schemas.microsoft.com/office/word/2024/wordml/sdtformatlock" xmlns:w16se="http://schemas.microsoft.com/office/word/2015/wordml/symex" xmlns:w16du="http://schemas.microsoft.com/office/word/2023/wordml/word16du" xmlns:wne="http://schemas.microsoft.com/office/word/2006/wordml" mc:Ignorable="w14 w15 w16se w16cid w16 w16cex w16sdtdh w16sdtfl w16du wp14">
   <w:body>
     <w:p>
       <w:pPr>
@@ -20,7 +20,7 @@
           <w:spacing w:val="-7"/>
           <w:w w:val="90"/>
         </w:rPr>
-        <w:t> </w:t>
+        <w:t xml:space="preserve"> </w:t>
       </w:r>
       <w:r>
         <w:rPr>
@@ -33,7 +33,7 @@
           <w:spacing w:val="-10"/>
           <w:w w:val="90"/>
         </w:rPr>
-        <w:t> </w:t>
+        <w:t xml:space="preserve"> </w:t>
       </w:r>
       <w:r>
         <w:rPr>
@@ -46,7 +46,7 @@
           <w:spacing w:val="-6"/>
           <w:w w:val="90"/>
         </w:rPr>
-        <w:t> </w:t>
+        <w:t xml:space="preserve"> </w:t>
       </w:r>
       <w:r>
         <w:rPr>
@@ -59,7 +59,7 @@
           <w:spacing w:val="-10"/>
           <w:w w:val="90"/>
         </w:rPr>
-        <w:t> </w:t>
+        <w:t xml:space="preserve"> </w:t>
       </w:r>
       <w:r>
         <w:rPr>
@@ -72,7 +72,7 @@
           <w:spacing w:val="-6"/>
           <w:w w:val="90"/>
         </w:rPr>
-        <w:t> </w:t>
+        <w:t xml:space="preserve"> </w:t>
       </w:r>
       <w:r>
         <w:rPr>
@@ -94,307 +94,46 @@
     <w:p>
       <w:pPr>
         <w:tabs>
-          <w:tab w:pos="5086" w:val="left" w:leader="none"/>
-          <w:tab w:pos="5121" w:val="left" w:leader="none"/>
-          <w:tab w:pos="5946" w:val="left" w:leader="none"/>
-          <w:tab w:pos="8071" w:val="left" w:leader="none"/>
-          <w:tab w:pos="8118" w:val="left" w:leader="none"/>
+          <w:tab w:val="left" w:pos="5086"/>
+          <w:tab w:val="left" w:pos="5121"/>
+          <w:tab w:val="left" w:pos="5946"/>
+          <w:tab w:val="left" w:pos="8071"/>
+          <w:tab w:val="left" w:pos="8118"/>
         </w:tabs>
-        <w:spacing w:line="254" w:lineRule="auto" w:before="0"/>
-        <w:ind w:left="164" w:right="20" w:firstLine="0"/>
+        <w:spacing w:line="254" w:lineRule="auto"/>
+        <w:ind w:left="164" w:right="20"/>
         <w:jc w:val="both"/>
-        <w:rPr>
-          <w:sz w:val="22"/>
-        </w:rPr>
       </w:pPr>
       <w:r>
-        <w:rPr>
-          <w:sz w:val="22"/>
-        </w:rPr>
-        <w:t xml:space="preserve">I/ Mr./Ms. </w:t>
-        <w:tab/>
-        <w:tab/>
-        <w:t xml:space="preserve">(company owner/ signatory for Name of Company), of legal age with address at </w:t>
-        <w:tab/>
-        <w:tab/>
-        <w:tab/>
-        <w:tab/>
-        <w:t xml:space="preserve"> , (Country), hereby appoint </w:t>
-        <w:tab/>
-        <w:tab/>
-        <w:tab/>
-        <w:t xml:space="preserve">LINK ASIA MANPOWER SOLUTIONS CORP., represented in this act by </w:t>
-        <w:tab/>
-        <w:t xml:space="preserve"> FEDERICO V. CORPUZ, President, likewise of legal age and with office address at </w:t>
-        <w:tab/>
-        <w:tab/>
-        <w:tab/>
-        <w:tab/>
-        <w:tab/>
-        <w:t>Unit 103, 8 Antonio Centre Building, Prime St., Madrigal Business Park 2, Brgy. Alabang, Muntinlupa City, Metro Manila, Philippines, as our true and legal representative to act for and on our behalf in our name and stead and to perform the following acts:</w:t>
-      </w:r>
-      <w:r>
-        <w:rPr>
-          <w:spacing w:val="40"/>
-          <w:sz w:val="22"/>
-        </w:rPr>
-      </w:r>
-      <w:r>
-        <w:rPr>
-          <w:b/>
-          <w:sz w:val="22"/>
-        </w:rPr>
-      </w:r>
-      <w:r>
-        <w:rPr>
-          <w:b/>
-          <w:spacing w:val="47"/>
-          <w:sz w:val="22"/>
-        </w:rPr>
-      </w:r>
-      <w:r>
-        <w:rPr>
-          <w:i/>
-          <w:sz w:val="22"/>
-          <w:u w:val="single"/>
-        </w:rPr>
-      </w:r>
-      <w:r>
-        <w:rPr>
-          <w:i/>
-          <w:sz w:val="22"/>
-        </w:rPr>
-      </w:r>
-      <w:r>
-        <w:rPr>
-          <w:sz w:val="22"/>
-        </w:rPr>
-      </w:r>
-      <w:r>
-        <w:rPr>
-          <w:spacing w:val="40"/>
-          <w:sz w:val="22"/>
-        </w:rPr>
-      </w:r>
-      <w:r>
-        <w:rPr>
-          <w:sz w:val="22"/>
-        </w:rPr>
-      </w:r>
-      <w:r>
-        <w:rPr>
-          <w:sz w:val="22"/>
-          <w:u w:val="single"/>
-        </w:rPr>
-      </w:r>
-      <w:r>
-        <w:rPr>
-          <w:spacing w:val="-16"/>
-          <w:sz w:val="22"/>
-        </w:rPr>
-      </w:r>
-      <w:r>
-        <w:rPr>
-          <w:spacing w:val="-2"/>
-          <w:sz w:val="22"/>
-        </w:rPr>
-      </w:r>
-      <w:r>
-        <w:rPr>
-          <w:spacing w:val="-13"/>
-          <w:sz w:val="22"/>
-        </w:rPr>
-      </w:r>
-      <w:r>
-        <w:rPr>
-          <w:spacing w:val="-2"/>
-          <w:sz w:val="22"/>
-        </w:rPr>
-      </w:r>
-      <w:r>
-        <w:rPr>
-          <w:sz w:val="22"/>
-        </w:rPr>
-      </w:r>
-      <w:r>
-        <w:rPr>
-          <w:spacing w:val="80"/>
-          <w:w w:val="150"/>
-          <w:sz w:val="22"/>
-        </w:rPr>
-      </w:r>
-      <w:r>
-        <w:rPr>
-          <w:sz w:val="22"/>
-        </w:rPr>
-      </w:r>
-      <w:r>
-        <w:rPr>
-          <w:spacing w:val="167"/>
-          <w:sz w:val="22"/>
-        </w:rPr>
-      </w:r>
-      <w:r>
-        <w:rPr>
-          <w:i/>
-          <w:sz w:val="22"/>
-          <w:u w:val="single"/>
-        </w:rPr>
-      </w:r>
-      <w:r>
-        <w:rPr>
-          <w:i/>
-          <w:sz w:val="22"/>
-        </w:rPr>
-      </w:r>
-      <w:r>
-        <w:rPr>
-          <w:sz w:val="22"/>
-        </w:rPr>
-      </w:r>
-      <w:r>
-        <w:rPr>
-          <w:sz w:val="22"/>
-          <w:u w:val="single"/>
-        </w:rPr>
-      </w:r>
-      <w:r>
-        <w:rPr>
-          <w:spacing w:val="-11"/>
-          <w:sz w:val="22"/>
-        </w:rPr>
-      </w:r>
-      <w:r>
-        <w:rPr>
-          <w:i/>
-          <w:spacing w:val="-2"/>
-          <w:sz w:val="22"/>
-        </w:rPr>
-      </w:r>
-      <w:r>
-        <w:rPr>
-          <w:i/>
-          <w:spacing w:val="-11"/>
-          <w:sz w:val="22"/>
-        </w:rPr>
-      </w:r>
-      <w:r>
-        <w:rPr>
-          <w:i/>
-          <w:spacing w:val="-2"/>
-          <w:sz w:val="22"/>
-        </w:rPr>
-      </w:r>
-      <w:r>
-        <w:rPr>
-          <w:i/>
-          <w:spacing w:val="-8"/>
-          <w:sz w:val="22"/>
-        </w:rPr>
-      </w:r>
-      <w:r>
-        <w:rPr>
-          <w:i/>
-          <w:spacing w:val="-2"/>
-          <w:sz w:val="22"/>
-        </w:rPr>
-      </w:r>
-      <w:r>
-        <w:rPr>
-          <w:i/>
-          <w:spacing w:val="-11"/>
-          <w:sz w:val="22"/>
-        </w:rPr>
-      </w:r>
-      <w:r>
-        <w:rPr>
-          <w:i/>
-          <w:spacing w:val="-2"/>
-          <w:sz w:val="22"/>
-        </w:rPr>
-      </w:r>
-      <w:r>
-        <w:rPr>
-          <w:i/>
-          <w:spacing w:val="-9"/>
-          <w:sz w:val="22"/>
-        </w:rPr>
-      </w:r>
-      <w:r>
-        <w:rPr>
-          <w:i/>
-          <w:spacing w:val="-2"/>
-          <w:sz w:val="22"/>
-        </w:rPr>
-      </w:r>
-      <w:r>
-        <w:rPr>
-          <w:spacing w:val="-2"/>
-          <w:sz w:val="22"/>
-        </w:rPr>
-      </w:r>
-      <w:r>
-        <w:rPr>
-          <w:sz w:val="22"/>
-        </w:rPr>
-      </w:r>
-      <w:r>
-        <w:rPr>
-          <w:i/>
-          <w:sz w:val="22"/>
-          <w:u w:val="single"/>
-        </w:rPr>
-      </w:r>
-      <w:r>
-        <w:rPr>
-          <w:i/>
-          <w:spacing w:val="-2"/>
-          <w:sz w:val="22"/>
-        </w:rPr>
-      </w:r>
-      <w:r>
-        <w:rPr>
-          <w:i/>
-          <w:spacing w:val="-14"/>
-          <w:sz w:val="22"/>
-        </w:rPr>
-      </w:r>
-      <w:r>
-        <w:rPr>
-          <w:i/>
-          <w:spacing w:val="-2"/>
-          <w:sz w:val="22"/>
-        </w:rPr>
-      </w:r>
-      <w:r>
-        <w:rPr>
-          <w:i/>
-          <w:sz w:val="22"/>
-        </w:rPr>
-      </w:r>
-      <w:r>
-        <w:rPr>
-          <w:b/>
-          <w:sz w:val="22"/>
-        </w:rPr>
-      </w:r>
-      <w:r>
-        <w:rPr>
-          <w:b/>
-          <w:spacing w:val="40"/>
-          <w:sz w:val="22"/>
-        </w:rPr>
-      </w:r>
-      <w:r>
-        <w:rPr>
-          <w:b/>
-          <w:sz w:val="22"/>
-        </w:rPr>
-      </w:r>
-      <w:r>
-        <w:rPr>
-          <w:sz w:val="22"/>
-        </w:rPr>
+        <w:t>I/ Mr./</w:t>
+      </w:r>
+      <w:proofErr w:type="gramStart"/>
+      <w:r>
+        <w:t>Ms.(</w:t>
+      </w:r>
+      <w:proofErr w:type="gramEnd"/>
+      <w:r>
+        <w:t>company owner/ signatory for Name of Company), of legal age with address</w:t>
+      </w:r>
+      <w:r>
+        <w:t xml:space="preserve"> at _________________________________________</w:t>
+      </w:r>
+      <w:r>
+        <w:t>, (Country), hereby appoint LINK ASIA MANPOWER SOLUTIONS CORP., represented in this act by FEDERICO V. CORPUZ, President, likewise of legal age and with office address at</w:t>
+      </w:r>
+      <w:r>
+        <w:t xml:space="preserve"> </w:t>
+      </w:r>
+      <w:r>
+        <w:t xml:space="preserve">Unit 103, 8 Antonio Centre Building, Prime St., Madrigal Business Park 2, </w:t>
+      </w:r>
+      <w:proofErr w:type="spellStart"/>
+      <w:r>
+        <w:t>Brgy</w:t>
+      </w:r>
+      <w:proofErr w:type="spellEnd"/>
+      <w:r>
+        <w:t>. Alabang, Muntinlupa City, Metro Manila, Philippines, as our true and legal representative to act for and on our behalf in our name and stead and to perform the following acts:</w:t>
       </w:r>
     </w:p>
     <w:p>
@@ -411,20 +150,13 @@
           <w:numId w:val="1"/>
         </w:numPr>
         <w:tabs>
-          <w:tab w:pos="1243" w:val="left" w:leader="none"/>
-          <w:tab w:pos="1245" w:val="left" w:leader="none"/>
+          <w:tab w:val="left" w:pos="1243"/>
+          <w:tab w:val="left" w:pos="1245"/>
         </w:tabs>
-        <w:spacing w:line="254" w:lineRule="auto" w:before="1" w:after="0"/>
-        <w:ind w:left="1245" w:right="767" w:hanging="360"/>
+        <w:spacing w:before="1" w:line="254" w:lineRule="auto"/>
         <w:jc w:val="both"/>
-        <w:rPr>
-          <w:sz w:val="22"/>
-        </w:rPr>
       </w:pPr>
       <w:r>
-        <w:rPr>
-          <w:sz w:val="22"/>
-        </w:rPr>
         <w:t>To represent our company before and all government and private client/agencies in the Philippines in the recruitment, hiring and placement of Filipino contract workers for overseas employment;</w:t>
       </w:r>
     </w:p>
@@ -442,176 +174,126 @@
           <w:numId w:val="1"/>
         </w:numPr>
         <w:tabs>
-          <w:tab w:pos="1242" w:val="left" w:leader="none"/>
-          <w:tab w:pos="1244" w:val="left" w:leader="none"/>
+          <w:tab w:val="left" w:pos="1242"/>
+          <w:tab w:val="left" w:pos="1244"/>
         </w:tabs>
-        <w:spacing w:line="254" w:lineRule="auto" w:before="0" w:after="0"/>
-        <w:ind w:left="1244" w:right="769" w:hanging="360"/>
+        <w:spacing w:line="254" w:lineRule="auto"/>
+        <w:ind w:left="1244" w:right="769"/>
         <w:jc w:val="both"/>
-        <w:rPr>
-          <w:sz w:val="22"/>
-        </w:rPr>
       </w:pPr>
       <w:r>
-        <w:rPr>
-          <w:sz w:val="22"/>
-        </w:rPr>
         <w:t>To</w:t>
       </w:r>
       <w:r>
         <w:rPr>
           <w:spacing w:val="-3"/>
-          <w:sz w:val="22"/>
-        </w:rPr>
-        <w:t> </w:t>
-      </w:r>
-      <w:r>
-        <w:rPr>
-          <w:sz w:val="22"/>
-        </w:rPr>
+        </w:rPr>
+        <w:t xml:space="preserve"> </w:t>
+      </w:r>
+      <w:proofErr w:type="gramStart"/>
+      <w:r>
         <w:t>enter</w:t>
       </w:r>
       <w:r>
         <w:rPr>
           <w:spacing w:val="-3"/>
-          <w:sz w:val="22"/>
-        </w:rPr>
-        <w:t> </w:t>
-      </w:r>
-      <w:r>
-        <w:rPr>
-          <w:sz w:val="22"/>
-        </w:rPr>
+        </w:rPr>
+        <w:t xml:space="preserve"> </w:t>
+      </w:r>
+      <w:r>
         <w:t>into</w:t>
       </w:r>
+      <w:proofErr w:type="gramEnd"/>
       <w:r>
         <w:rPr>
           <w:spacing w:val="-3"/>
-          <w:sz w:val="22"/>
-        </w:rPr>
-        <w:t> </w:t>
-      </w:r>
-      <w:r>
-        <w:rPr>
-          <w:sz w:val="22"/>
-        </w:rPr>
+        </w:rPr>
+        <w:t xml:space="preserve"> </w:t>
+      </w:r>
+      <w:proofErr w:type="gramStart"/>
+      <w:r>
         <w:t>any</w:t>
       </w:r>
       <w:r>
         <w:rPr>
           <w:spacing w:val="-2"/>
-          <w:sz w:val="22"/>
-        </w:rPr>
-        <w:t> </w:t>
-      </w:r>
-      <w:r>
-        <w:rPr>
-          <w:sz w:val="22"/>
-        </w:rPr>
+        </w:rPr>
+        <w:t xml:space="preserve"> </w:t>
+      </w:r>
+      <w:r>
         <w:t>and</w:t>
       </w:r>
       <w:r>
         <w:rPr>
           <w:spacing w:val="-2"/>
-          <w:sz w:val="22"/>
-        </w:rPr>
-        <w:t> </w:t>
-      </w:r>
-      <w:r>
-        <w:rPr>
-          <w:sz w:val="22"/>
-        </w:rPr>
+        </w:rPr>
+        <w:t xml:space="preserve"> </w:t>
+      </w:r>
+      <w:r>
         <w:t>all</w:t>
       </w:r>
+      <w:proofErr w:type="gramEnd"/>
       <w:r>
         <w:rPr>
           <w:spacing w:val="-3"/>
-          <w:sz w:val="22"/>
-        </w:rPr>
-        <w:t> </w:t>
-      </w:r>
-      <w:r>
-        <w:rPr>
-          <w:sz w:val="22"/>
-        </w:rPr>
+        </w:rPr>
+        <w:t xml:space="preserve"> </w:t>
+      </w:r>
+      <w:r>
         <w:t>contracts</w:t>
       </w:r>
       <w:r>
         <w:rPr>
           <w:spacing w:val="-3"/>
-          <w:sz w:val="22"/>
-        </w:rPr>
-        <w:t> </w:t>
-      </w:r>
-      <w:r>
-        <w:rPr>
-          <w:sz w:val="22"/>
-        </w:rPr>
+        </w:rPr>
+        <w:t xml:space="preserve"> </w:t>
+      </w:r>
+      <w:r>
         <w:t>with</w:t>
       </w:r>
       <w:r>
         <w:rPr>
           <w:spacing w:val="-3"/>
-          <w:sz w:val="22"/>
-        </w:rPr>
-        <w:t> </w:t>
-      </w:r>
-      <w:r>
-        <w:rPr>
-          <w:sz w:val="22"/>
-        </w:rPr>
+        </w:rPr>
+        <w:t xml:space="preserve"> </w:t>
+      </w:r>
+      <w:r>
         <w:t>any</w:t>
       </w:r>
       <w:r>
         <w:rPr>
           <w:spacing w:val="-2"/>
-          <w:sz w:val="22"/>
-        </w:rPr>
-        <w:t> </w:t>
-      </w:r>
-      <w:r>
-        <w:rPr>
-          <w:sz w:val="22"/>
-        </w:rPr>
+        </w:rPr>
+        <w:t xml:space="preserve"> </w:t>
+      </w:r>
+      <w:r>
         <w:t>person,</w:t>
       </w:r>
       <w:r>
         <w:rPr>
           <w:spacing w:val="-4"/>
-          <w:sz w:val="22"/>
-        </w:rPr>
-        <w:t> </w:t>
-      </w:r>
-      <w:r>
-        <w:rPr>
-          <w:sz w:val="22"/>
-        </w:rPr>
+        </w:rPr>
+        <w:t xml:space="preserve"> </w:t>
+      </w:r>
+      <w:r>
         <w:t>corporation,</w:t>
       </w:r>
       <w:r>
         <w:rPr>
           <w:spacing w:val="-4"/>
-          <w:sz w:val="22"/>
-        </w:rPr>
-        <w:t> </w:t>
-      </w:r>
-      <w:r>
-        <w:rPr>
-          <w:sz w:val="22"/>
-        </w:rPr>
+        </w:rPr>
+        <w:t xml:space="preserve"> </w:t>
+      </w:r>
+      <w:r>
         <w:t>institution in the recruitment, hiring and placement of Filipino contract workers for overseas</w:t>
       </w:r>
       <w:r>
         <w:rPr>
           <w:spacing w:val="-10"/>
-          <w:sz w:val="22"/>
-        </w:rPr>
-        <w:t> </w:t>
-      </w:r>
-      <w:r>
-        <w:rPr>
-          <w:sz w:val="22"/>
-        </w:rPr>
+        </w:rPr>
+        <w:t xml:space="preserve"> </w:t>
+      </w:r>
+      <w:r>
         <w:t>employment;</w:t>
       </w:r>
     </w:p>
@@ -629,150 +311,104 @@
           <w:numId w:val="1"/>
         </w:numPr>
         <w:tabs>
-          <w:tab w:pos="1242" w:val="left" w:leader="none"/>
-          <w:tab w:pos="1244" w:val="left" w:leader="none"/>
+          <w:tab w:val="left" w:pos="1242"/>
+          <w:tab w:val="left" w:pos="1244"/>
         </w:tabs>
-        <w:spacing w:line="254" w:lineRule="auto" w:before="0" w:after="0"/>
-        <w:ind w:left="1244" w:right="767" w:hanging="360"/>
+        <w:spacing w:line="254" w:lineRule="auto"/>
+        <w:ind w:left="1244"/>
         <w:jc w:val="both"/>
-        <w:rPr>
-          <w:sz w:val="22"/>
-        </w:rPr>
       </w:pPr>
       <w:r>
-        <w:rPr>
-          <w:sz w:val="22"/>
-        </w:rPr>
         <w:t>To</w:t>
       </w:r>
       <w:r>
         <w:rPr>
           <w:spacing w:val="-14"/>
-          <w:sz w:val="22"/>
-        </w:rPr>
-        <w:t> </w:t>
-      </w:r>
-      <w:r>
-        <w:rPr>
-          <w:sz w:val="22"/>
-        </w:rPr>
+        </w:rPr>
+        <w:t xml:space="preserve"> </w:t>
+      </w:r>
+      <w:r>
         <w:t>sign,</w:t>
       </w:r>
       <w:r>
         <w:rPr>
           <w:spacing w:val="-13"/>
-          <w:sz w:val="22"/>
-        </w:rPr>
-        <w:t> </w:t>
-      </w:r>
-      <w:r>
-        <w:rPr>
-          <w:sz w:val="22"/>
-        </w:rPr>
+        </w:rPr>
+        <w:t xml:space="preserve"> </w:t>
+      </w:r>
+      <w:r>
         <w:t>authenticate</w:t>
       </w:r>
       <w:r>
         <w:rPr>
           <w:spacing w:val="-11"/>
-          <w:sz w:val="22"/>
-        </w:rPr>
-        <w:t> </w:t>
-      </w:r>
-      <w:r>
-        <w:rPr>
-          <w:sz w:val="22"/>
-        </w:rPr>
+        </w:rPr>
+        <w:t xml:space="preserve"> </w:t>
+      </w:r>
+      <w:r>
         <w:t>and</w:t>
       </w:r>
       <w:r>
         <w:rPr>
           <w:spacing w:val="-11"/>
-          <w:sz w:val="22"/>
-        </w:rPr>
-        <w:t> </w:t>
-      </w:r>
-      <w:r>
-        <w:rPr>
-          <w:sz w:val="22"/>
-        </w:rPr>
+        </w:rPr>
+        <w:t xml:space="preserve"> </w:t>
+      </w:r>
+      <w:r>
         <w:t>deliver</w:t>
       </w:r>
       <w:r>
         <w:rPr>
           <w:spacing w:val="-11"/>
-          <w:sz w:val="22"/>
-        </w:rPr>
-        <w:t> </w:t>
-      </w:r>
-      <w:r>
-        <w:rPr>
-          <w:sz w:val="22"/>
-        </w:rPr>
+        </w:rPr>
+        <w:t xml:space="preserve"> </w:t>
+      </w:r>
+      <w:r>
         <w:t>all</w:t>
       </w:r>
       <w:r>
         <w:rPr>
           <w:spacing w:val="-12"/>
-          <w:sz w:val="22"/>
-        </w:rPr>
-        <w:t> </w:t>
-      </w:r>
-      <w:r>
-        <w:rPr>
-          <w:sz w:val="22"/>
-        </w:rPr>
+        </w:rPr>
+        <w:t xml:space="preserve"> </w:t>
+      </w:r>
+      <w:r>
         <w:t>documents</w:t>
       </w:r>
       <w:r>
         <w:rPr>
           <w:spacing w:val="-11"/>
-          <w:sz w:val="22"/>
-        </w:rPr>
-        <w:t> </w:t>
-      </w:r>
-      <w:r>
-        <w:rPr>
-          <w:sz w:val="22"/>
-        </w:rPr>
+        </w:rPr>
+        <w:t xml:space="preserve"> </w:t>
+      </w:r>
+      <w:r>
         <w:t>necessary</w:t>
       </w:r>
       <w:r>
         <w:rPr>
           <w:spacing w:val="-11"/>
-          <w:sz w:val="22"/>
-        </w:rPr>
-        <w:t> </w:t>
-      </w:r>
-      <w:r>
-        <w:rPr>
-          <w:sz w:val="22"/>
-        </w:rPr>
+        </w:rPr>
+        <w:t xml:space="preserve"> </w:t>
+      </w:r>
+      <w:r>
         <w:t>to</w:t>
       </w:r>
       <w:r>
         <w:rPr>
           <w:spacing w:val="-11"/>
-          <w:sz w:val="22"/>
-        </w:rPr>
-        <w:t> </w:t>
-      </w:r>
-      <w:r>
-        <w:rPr>
-          <w:sz w:val="22"/>
-        </w:rPr>
+        </w:rPr>
+        <w:t xml:space="preserve"> </w:t>
+      </w:r>
+      <w:r>
         <w:t>complete</w:t>
       </w:r>
       <w:r>
         <w:rPr>
           <w:spacing w:val="-11"/>
-          <w:sz w:val="22"/>
-        </w:rPr>
-        <w:t> </w:t>
-      </w:r>
-      <w:r>
-        <w:rPr>
-          <w:sz w:val="22"/>
-        </w:rPr>
+        </w:rPr>
+        <w:t xml:space="preserve"> </w:t>
+      </w:r>
+      <w:r>
         <w:t>any transaction related to such recruiting and hiring, including making the necessary steps to facilitate the departure of the recruited workers;</w:t>
       </w:r>
     </w:p>
@@ -790,345 +426,241 @@
           <w:numId w:val="1"/>
         </w:numPr>
         <w:tabs>
-          <w:tab w:pos="1242" w:val="left" w:leader="none"/>
-          <w:tab w:pos="1244" w:val="left" w:leader="none"/>
+          <w:tab w:val="left" w:pos="1242"/>
+          <w:tab w:val="left" w:pos="1244"/>
         </w:tabs>
-        <w:spacing w:line="254" w:lineRule="auto" w:before="1" w:after="0"/>
-        <w:ind w:left="1244" w:right="769" w:hanging="360"/>
+        <w:spacing w:before="1" w:line="254" w:lineRule="auto"/>
+        <w:ind w:left="1244" w:right="769"/>
         <w:jc w:val="both"/>
-        <w:rPr>
-          <w:sz w:val="22"/>
-        </w:rPr>
       </w:pPr>
       <w:r>
-        <w:rPr>
-          <w:sz w:val="22"/>
-        </w:rPr>
         <w:t>To</w:t>
       </w:r>
       <w:r>
         <w:rPr>
           <w:spacing w:val="-10"/>
-          <w:sz w:val="22"/>
-        </w:rPr>
-        <w:t> </w:t>
-      </w:r>
-      <w:r>
-        <w:rPr>
-          <w:sz w:val="22"/>
-        </w:rPr>
+        </w:rPr>
+        <w:t xml:space="preserve"> </w:t>
+      </w:r>
+      <w:r>
         <w:t>bring</w:t>
       </w:r>
       <w:r>
         <w:rPr>
           <w:spacing w:val="-7"/>
-          <w:sz w:val="22"/>
-        </w:rPr>
-        <w:t> </w:t>
-      </w:r>
-      <w:r>
-        <w:rPr>
-          <w:sz w:val="22"/>
-        </w:rPr>
+        </w:rPr>
+        <w:t xml:space="preserve"> </w:t>
+      </w:r>
+      <w:r>
         <w:t>suit,</w:t>
       </w:r>
       <w:r>
         <w:rPr>
           <w:spacing w:val="-9"/>
-          <w:sz w:val="22"/>
-        </w:rPr>
-        <w:t> </w:t>
-      </w:r>
-      <w:r>
-        <w:rPr>
-          <w:sz w:val="22"/>
-        </w:rPr>
+        </w:rPr>
+        <w:t xml:space="preserve"> </w:t>
+      </w:r>
+      <w:r>
         <w:t>defend</w:t>
       </w:r>
       <w:r>
         <w:rPr>
           <w:spacing w:val="-7"/>
-          <w:sz w:val="22"/>
-        </w:rPr>
-        <w:t> </w:t>
-      </w:r>
-      <w:r>
-        <w:rPr>
-          <w:sz w:val="22"/>
-        </w:rPr>
+        </w:rPr>
+        <w:t xml:space="preserve"> </w:t>
+      </w:r>
+      <w:r>
         <w:t>and</w:t>
       </w:r>
       <w:r>
         <w:rPr>
           <w:spacing w:val="-7"/>
-          <w:sz w:val="22"/>
-        </w:rPr>
-        <w:t> </w:t>
-      </w:r>
-      <w:r>
-        <w:rPr>
-          <w:sz w:val="22"/>
-        </w:rPr>
+        </w:rPr>
+        <w:t xml:space="preserve"> </w:t>
+      </w:r>
+      <w:proofErr w:type="gramStart"/>
+      <w:r>
         <w:t>enter</w:t>
       </w:r>
       <w:r>
         <w:rPr>
           <w:spacing w:val="-8"/>
-          <w:sz w:val="22"/>
-        </w:rPr>
-        <w:t> </w:t>
-      </w:r>
-      <w:r>
-        <w:rPr>
-          <w:sz w:val="22"/>
-        </w:rPr>
+        </w:rPr>
+        <w:t xml:space="preserve"> </w:t>
+      </w:r>
+      <w:r>
         <w:t>into</w:t>
       </w:r>
+      <w:proofErr w:type="gramEnd"/>
       <w:r>
         <w:rPr>
           <w:spacing w:val="-10"/>
-          <w:sz w:val="22"/>
-        </w:rPr>
-        <w:t> </w:t>
-      </w:r>
-      <w:r>
-        <w:rPr>
-          <w:sz w:val="22"/>
-        </w:rPr>
+        </w:rPr>
+        <w:t xml:space="preserve"> </w:t>
+      </w:r>
+      <w:r>
         <w:t>compromises</w:t>
       </w:r>
       <w:r>
         <w:rPr>
           <w:spacing w:val="-8"/>
-          <w:sz w:val="22"/>
-        </w:rPr>
-        <w:t> </w:t>
-      </w:r>
-      <w:r>
-        <w:rPr>
-          <w:sz w:val="22"/>
-        </w:rPr>
+        </w:rPr>
+        <w:t xml:space="preserve"> </w:t>
+      </w:r>
+      <w:r>
         <w:t>in</w:t>
       </w:r>
       <w:r>
         <w:rPr>
           <w:spacing w:val="-8"/>
-          <w:sz w:val="22"/>
-        </w:rPr>
-        <w:t> </w:t>
-      </w:r>
-      <w:r>
-        <w:rPr>
-          <w:sz w:val="22"/>
-        </w:rPr>
+        </w:rPr>
+        <w:t xml:space="preserve"> </w:t>
+      </w:r>
+      <w:r>
         <w:t>our</w:t>
       </w:r>
       <w:r>
         <w:rPr>
           <w:spacing w:val="-8"/>
-          <w:sz w:val="22"/>
-        </w:rPr>
-        <w:t> </w:t>
-      </w:r>
-      <w:r>
-        <w:rPr>
-          <w:sz w:val="22"/>
-        </w:rPr>
+        </w:rPr>
+        <w:t xml:space="preserve"> </w:t>
+      </w:r>
+      <w:r>
         <w:t>name</w:t>
       </w:r>
       <w:r>
         <w:rPr>
           <w:spacing w:val="-7"/>
-          <w:sz w:val="22"/>
-        </w:rPr>
-        <w:t> </w:t>
-      </w:r>
-      <w:r>
-        <w:rPr>
-          <w:sz w:val="22"/>
-        </w:rPr>
+        </w:rPr>
+        <w:t xml:space="preserve"> </w:t>
+      </w:r>
+      <w:r>
         <w:t>and</w:t>
       </w:r>
       <w:r>
         <w:rPr>
           <w:spacing w:val="-7"/>
-          <w:sz w:val="22"/>
-        </w:rPr>
-        <w:t> </w:t>
-      </w:r>
-      <w:r>
-        <w:rPr>
-          <w:sz w:val="22"/>
-        </w:rPr>
+        </w:rPr>
+        <w:t xml:space="preserve"> </w:t>
+      </w:r>
+      <w:r>
         <w:t>stead</w:t>
       </w:r>
       <w:r>
         <w:rPr>
           <w:spacing w:val="-7"/>
-          <w:sz w:val="22"/>
-        </w:rPr>
-        <w:t> </w:t>
-      </w:r>
-      <w:r>
-        <w:rPr>
-          <w:sz w:val="22"/>
-        </w:rPr>
+        </w:rPr>
+        <w:t xml:space="preserve"> </w:t>
+      </w:r>
+      <w:r>
         <w:t>in litigation</w:t>
       </w:r>
       <w:r>
         <w:rPr>
           <w:spacing w:val="-5"/>
-          <w:sz w:val="22"/>
-        </w:rPr>
-        <w:t> </w:t>
-      </w:r>
-      <w:r>
-        <w:rPr>
-          <w:sz w:val="22"/>
-        </w:rPr>
+        </w:rPr>
+        <w:t xml:space="preserve"> </w:t>
+      </w:r>
+      <w:r>
         <w:t>brought</w:t>
       </w:r>
       <w:r>
         <w:rPr>
           <w:spacing w:val="-5"/>
-          <w:sz w:val="22"/>
-        </w:rPr>
-        <w:t> </w:t>
-      </w:r>
-      <w:r>
-        <w:rPr>
-          <w:sz w:val="22"/>
-        </w:rPr>
+        </w:rPr>
+        <w:t xml:space="preserve"> </w:t>
+      </w:r>
+      <w:r>
         <w:t>for</w:t>
       </w:r>
       <w:r>
         <w:rPr>
           <w:spacing w:val="-5"/>
-          <w:sz w:val="22"/>
-        </w:rPr>
-        <w:t> </w:t>
-      </w:r>
-      <w:r>
-        <w:rPr>
-          <w:sz w:val="22"/>
-        </w:rPr>
+        </w:rPr>
+        <w:t xml:space="preserve"> </w:t>
+      </w:r>
+      <w:r>
         <w:t>or</w:t>
       </w:r>
       <w:r>
         <w:rPr>
           <w:spacing w:val="-5"/>
-          <w:sz w:val="22"/>
-        </w:rPr>
-        <w:t> </w:t>
-      </w:r>
-      <w:r>
-        <w:rPr>
-          <w:sz w:val="22"/>
-        </w:rPr>
+        </w:rPr>
+        <w:t xml:space="preserve"> </w:t>
+      </w:r>
+      <w:r>
         <w:t>against</w:t>
       </w:r>
       <w:r>
         <w:rPr>
           <w:spacing w:val="-5"/>
-          <w:sz w:val="22"/>
-        </w:rPr>
-        <w:t> </w:t>
-      </w:r>
-      <w:r>
-        <w:rPr>
-          <w:sz w:val="22"/>
-        </w:rPr>
+        </w:rPr>
+        <w:t xml:space="preserve"> </w:t>
+      </w:r>
+      <w:r>
         <w:t>us</w:t>
       </w:r>
       <w:r>
         <w:rPr>
           <w:spacing w:val="-3"/>
-          <w:sz w:val="22"/>
-        </w:rPr>
-        <w:t> </w:t>
-      </w:r>
-      <w:r>
-        <w:rPr>
-          <w:sz w:val="22"/>
-        </w:rPr>
+        </w:rPr>
+        <w:t xml:space="preserve"> </w:t>
+      </w:r>
+      <w:r>
         <w:t>(or</w:t>
       </w:r>
       <w:r>
         <w:rPr>
           <w:spacing w:val="-5"/>
-          <w:sz w:val="22"/>
-        </w:rPr>
-        <w:t> </w:t>
-      </w:r>
-      <w:r>
-        <w:rPr>
-          <w:sz w:val="22"/>
-        </w:rPr>
+        </w:rPr>
+        <w:t xml:space="preserve"> </w:t>
+      </w:r>
+      <w:r>
         <w:t>our</w:t>
       </w:r>
       <w:r>
         <w:rPr>
           <w:spacing w:val="-5"/>
-          <w:sz w:val="22"/>
-        </w:rPr>
-        <w:t> </w:t>
-      </w:r>
-      <w:r>
-        <w:rPr>
-          <w:sz w:val="22"/>
-        </w:rPr>
+        </w:rPr>
+        <w:t xml:space="preserve"> </w:t>
+      </w:r>
+      <w:r>
         <w:t>company)</w:t>
       </w:r>
       <w:r>
         <w:rPr>
           <w:spacing w:val="-6"/>
-          <w:sz w:val="22"/>
-        </w:rPr>
-        <w:t> </w:t>
-      </w:r>
-      <w:r>
-        <w:rPr>
-          <w:sz w:val="22"/>
-        </w:rPr>
+        </w:rPr>
+        <w:t xml:space="preserve"> </w:t>
+      </w:r>
+      <w:r>
         <w:t>in</w:t>
       </w:r>
       <w:r>
         <w:rPr>
           <w:spacing w:val="-5"/>
-          <w:sz w:val="22"/>
-        </w:rPr>
-        <w:t> </w:t>
-      </w:r>
-      <w:r>
-        <w:rPr>
-          <w:sz w:val="22"/>
-        </w:rPr>
+        </w:rPr>
+        <w:t xml:space="preserve"> </w:t>
+      </w:r>
+      <w:r>
         <w:t>all</w:t>
       </w:r>
       <w:r>
         <w:rPr>
           <w:spacing w:val="-6"/>
-          <w:sz w:val="22"/>
-        </w:rPr>
-        <w:t> </w:t>
-      </w:r>
-      <w:r>
-        <w:rPr>
-          <w:sz w:val="22"/>
-        </w:rPr>
+        </w:rPr>
+        <w:t xml:space="preserve"> </w:t>
+      </w:r>
+      <w:r>
         <w:t>matters</w:t>
       </w:r>
       <w:r>
         <w:rPr>
           <w:spacing w:val="-3"/>
-          <w:sz w:val="22"/>
-        </w:rPr>
-        <w:t> </w:t>
-      </w:r>
-      <w:r>
-        <w:rPr>
-          <w:sz w:val="22"/>
-        </w:rPr>
+        </w:rPr>
+        <w:t xml:space="preserve"> </w:t>
+      </w:r>
+      <w:r>
         <w:t>involving the employment of the Filipino contract workers for our company;</w:t>
       </w:r>
     </w:p>
@@ -1146,20 +678,14 @@
           <w:numId w:val="1"/>
         </w:numPr>
         <w:tabs>
-          <w:tab w:pos="1242" w:val="left" w:leader="none"/>
-          <w:tab w:pos="1244" w:val="left" w:leader="none"/>
+          <w:tab w:val="left" w:pos="1242"/>
+          <w:tab w:val="left" w:pos="1244"/>
         </w:tabs>
-        <w:spacing w:line="254" w:lineRule="auto" w:before="0" w:after="0"/>
-        <w:ind w:left="1244" w:right="767" w:hanging="360"/>
+        <w:spacing w:line="254" w:lineRule="auto"/>
+        <w:ind w:left="1244"/>
         <w:jc w:val="both"/>
-        <w:rPr>
-          <w:sz w:val="22"/>
-        </w:rPr>
       </w:pPr>
       <w:r>
-        <w:rPr>
-          <w:sz w:val="22"/>
-        </w:rPr>
         <w:t>To assume jointly and solidarity with the undersigned (our company) any liability that may arise in connection with the worker’s recruitment and/or implementation of the employment contract and other terms and conditions of the appointment as defined and spelled out in the attached agreement which we have previously executed.</w:t>
       </w:r>
     </w:p>
@@ -1188,7 +714,7 @@
           <w:b/>
           <w:spacing w:val="-7"/>
         </w:rPr>
-        <w:t> </w:t>
+        <w:t xml:space="preserve"> </w:t>
       </w:r>
       <w:r>
         <w:rPr>
@@ -1202,7 +728,7 @@
           <w:b/>
           <w:spacing w:val="-5"/>
         </w:rPr>
-        <w:t> </w:t>
+        <w:t xml:space="preserve"> </w:t>
       </w:r>
       <w:r>
         <w:rPr>
@@ -1214,7 +740,7 @@
         <w:rPr>
           <w:spacing w:val="-6"/>
         </w:rPr>
-        <w:t> </w:t>
+        <w:t xml:space="preserve"> </w:t>
       </w:r>
       <w:r>
         <w:rPr>
@@ -1226,7 +752,7 @@
         <w:rPr>
           <w:spacing w:val="-7"/>
         </w:rPr>
-        <w:t> </w:t>
+        <w:t xml:space="preserve"> </w:t>
       </w:r>
       <w:r>
         <w:rPr>
@@ -1238,266 +764,240 @@
         <w:rPr>
           <w:spacing w:val="-6"/>
         </w:rPr>
-        <w:t> </w:t>
+        <w:t xml:space="preserve"> </w:t>
       </w:r>
       <w:r>
         <w:rPr>
           <w:spacing w:val="-4"/>
         </w:rPr>
-        <w:t>to execute or </w:t>
-      </w:r>
-      <w:r>
-        <w:rPr/>
+        <w:t xml:space="preserve">to execute or </w:t>
+      </w:r>
+      <w:r>
         <w:t>perform whatever requisite only for the mission of recruiting, hiring and replacing of Filipino contract workers for overseas employment as we might or lawfully do if personally present with,</w:t>
       </w:r>
       <w:r>
         <w:rPr>
           <w:spacing w:val="-9"/>
         </w:rPr>
-        <w:t> </w:t>
-      </w:r>
-      <w:r>
-        <w:rPr/>
+        <w:t xml:space="preserve"> </w:t>
+      </w:r>
+      <w:r>
         <w:t>and</w:t>
       </w:r>
       <w:r>
         <w:rPr>
           <w:spacing w:val="-4"/>
         </w:rPr>
-        <w:t> </w:t>
-      </w:r>
-      <w:r>
-        <w:rPr/>
+        <w:t xml:space="preserve"> </w:t>
+      </w:r>
+      <w:r>
         <w:t>confirming</w:t>
       </w:r>
       <w:r>
         <w:rPr>
           <w:spacing w:val="-7"/>
         </w:rPr>
-        <w:t> </w:t>
-      </w:r>
-      <w:r>
-        <w:rPr/>
+        <w:t xml:space="preserve"> </w:t>
+      </w:r>
+      <w:r>
         <w:t>all</w:t>
       </w:r>
       <w:r>
         <w:rPr>
           <w:spacing w:val="-5"/>
         </w:rPr>
-        <w:t> </w:t>
-      </w:r>
-      <w:r>
-        <w:rPr/>
+        <w:t xml:space="preserve"> </w:t>
+      </w:r>
+      <w:r>
         <w:t>that</w:t>
       </w:r>
       <w:r>
         <w:rPr>
           <w:spacing w:val="-7"/>
         </w:rPr>
-        <w:t> </w:t>
-      </w:r>
-      <w:r>
-        <w:rPr/>
+        <w:t xml:space="preserve"> </w:t>
+      </w:r>
+      <w:r>
         <w:t>our</w:t>
       </w:r>
       <w:r>
         <w:rPr>
           <w:spacing w:val="-5"/>
         </w:rPr>
-        <w:t> </w:t>
-      </w:r>
-      <w:r>
-        <w:rPr/>
+        <w:t xml:space="preserve"> </w:t>
+      </w:r>
+      <w:r>
         <w:t>said</w:t>
       </w:r>
       <w:r>
         <w:rPr>
           <w:spacing w:val="-7"/>
         </w:rPr>
-        <w:t> </w:t>
-      </w:r>
-      <w:r>
-        <w:rPr/>
+        <w:t xml:space="preserve"> </w:t>
+      </w:r>
+      <w:r>
         <w:t>legal</w:t>
       </w:r>
       <w:r>
         <w:rPr>
           <w:spacing w:val="-5"/>
         </w:rPr>
-        <w:t> </w:t>
-      </w:r>
-      <w:r>
-        <w:rPr/>
+        <w:t xml:space="preserve"> </w:t>
+      </w:r>
+      <w:r>
         <w:t>representative</w:t>
       </w:r>
       <w:r>
         <w:rPr>
           <w:spacing w:val="-6"/>
         </w:rPr>
-        <w:t> </w:t>
-      </w:r>
-      <w:r>
-        <w:rPr/>
+        <w:t xml:space="preserve"> </w:t>
+      </w:r>
+      <w:r>
         <w:t>or</w:t>
       </w:r>
       <w:r>
         <w:rPr>
           <w:spacing w:val="-5"/>
         </w:rPr>
-        <w:t> </w:t>
-      </w:r>
-      <w:r>
-        <w:rPr/>
+        <w:t xml:space="preserve"> </w:t>
+      </w:r>
+      <w:r>
         <w:t>his/her</w:t>
       </w:r>
       <w:r>
         <w:rPr>
           <w:spacing w:val="-7"/>
         </w:rPr>
-        <w:t> </w:t>
-      </w:r>
-      <w:r>
-        <w:rPr/>
+        <w:t xml:space="preserve"> </w:t>
+      </w:r>
+      <w:r>
         <w:t>substitute</w:t>
       </w:r>
       <w:r>
         <w:rPr>
           <w:spacing w:val="-4"/>
         </w:rPr>
-        <w:t> </w:t>
-      </w:r>
-      <w:r>
-        <w:rPr/>
+        <w:t xml:space="preserve"> </w:t>
+      </w:r>
+      <w:r>
         <w:t>shall</w:t>
       </w:r>
       <w:r>
         <w:rPr>
           <w:spacing w:val="-9"/>
         </w:rPr>
-        <w:t> </w:t>
-      </w:r>
-      <w:r>
-        <w:rPr/>
+        <w:t xml:space="preserve"> </w:t>
+      </w:r>
+      <w:r>
         <w:t>lawfully</w:t>
       </w:r>
       <w:r>
         <w:rPr>
           <w:spacing w:val="-4"/>
         </w:rPr>
-        <w:t> </w:t>
-      </w:r>
-      <w:r>
-        <w:rPr/>
+        <w:t xml:space="preserve"> </w:t>
+      </w:r>
+      <w:r>
         <w:t>do our</w:t>
       </w:r>
       <w:r>
         <w:rPr>
           <w:spacing w:val="-5"/>
         </w:rPr>
-        <w:t> </w:t>
-      </w:r>
-      <w:r>
-        <w:rPr/>
+        <w:t xml:space="preserve"> </w:t>
+      </w:r>
+      <w:r>
         <w:t>cause</w:t>
       </w:r>
       <w:r>
         <w:rPr>
           <w:spacing w:val="-3"/>
         </w:rPr>
-        <w:t> </w:t>
-      </w:r>
-      <w:r>
-        <w:rPr/>
+        <w:t xml:space="preserve"> </w:t>
+      </w:r>
+      <w:r>
         <w:t>to</w:t>
       </w:r>
       <w:r>
         <w:rPr>
           <w:spacing w:val="-5"/>
         </w:rPr>
-        <w:t> </w:t>
-      </w:r>
-      <w:r>
-        <w:rPr/>
+        <w:t xml:space="preserve"> </w:t>
+      </w:r>
+      <w:r>
         <w:t>be</w:t>
       </w:r>
       <w:r>
         <w:rPr>
           <w:spacing w:val="-3"/>
         </w:rPr>
-        <w:t> </w:t>
-      </w:r>
-      <w:r>
-        <w:rPr/>
+        <w:t xml:space="preserve"> </w:t>
+      </w:r>
+      <w:r>
         <w:t>done</w:t>
       </w:r>
       <w:r>
         <w:rPr>
           <w:spacing w:val="-3"/>
         </w:rPr>
-        <w:t> </w:t>
-      </w:r>
-      <w:r>
-        <w:rPr/>
+        <w:t xml:space="preserve"> </w:t>
+      </w:r>
+      <w:r>
         <w:t>under</w:t>
       </w:r>
       <w:r>
         <w:rPr>
           <w:spacing w:val="-5"/>
         </w:rPr>
-        <w:t> </w:t>
-      </w:r>
-      <w:r>
-        <w:rPr/>
+        <w:t xml:space="preserve"> </w:t>
+      </w:r>
+      <w:r>
         <w:t>and</w:t>
       </w:r>
       <w:r>
         <w:rPr>
           <w:spacing w:val="-3"/>
         </w:rPr>
-        <w:t> </w:t>
-      </w:r>
-      <w:r>
-        <w:rPr/>
+        <w:t xml:space="preserve"> </w:t>
+      </w:r>
+      <w:r>
         <w:t>by</w:t>
       </w:r>
       <w:r>
         <w:rPr>
           <w:spacing w:val="-3"/>
         </w:rPr>
-        <w:t> </w:t>
-      </w:r>
-      <w:r>
-        <w:rPr/>
+        <w:t xml:space="preserve"> </w:t>
+      </w:r>
+      <w:r>
         <w:t>virtue</w:t>
       </w:r>
       <w:r>
         <w:rPr>
           <w:spacing w:val="-3"/>
         </w:rPr>
-        <w:t> </w:t>
-      </w:r>
-      <w:r>
-        <w:rPr/>
+        <w:t xml:space="preserve"> </w:t>
+      </w:r>
+      <w:r>
         <w:t>of</w:t>
       </w:r>
       <w:r>
         <w:rPr>
           <w:spacing w:val="-3"/>
         </w:rPr>
-        <w:t> </w:t>
-      </w:r>
-      <w:r>
-        <w:rPr/>
+        <w:t xml:space="preserve"> </w:t>
+      </w:r>
+      <w:r>
         <w:t>these</w:t>
       </w:r>
       <w:r>
         <w:rPr>
           <w:spacing w:val="-3"/>
         </w:rPr>
-        <w:t> </w:t>
-      </w:r>
-      <w:r>
-        <w:rPr/>
+        <w:t xml:space="preserve"> </w:t>
+      </w:r>
+      <w:r>
         <w:t>presents.</w:t>
       </w:r>
     </w:p>
@@ -1511,9 +1011,9 @@
       <w:pPr>
         <w:pStyle w:val="BodyText"/>
         <w:tabs>
-          <w:tab w:pos="1822" w:val="left" w:leader="none"/>
-          <w:tab w:pos="4261" w:val="left" w:leader="none"/>
-          <w:tab w:pos="5017" w:val="left" w:leader="none"/>
+          <w:tab w:val="left" w:pos="1822"/>
+          <w:tab w:val="left" w:pos="4261"/>
+          <w:tab w:val="left" w:pos="5017"/>
         </w:tabs>
         <w:spacing w:line="508" w:lineRule="auto"/>
         <w:ind w:left="884" w:right="2164"/>
@@ -1530,7 +1030,7 @@
           <w:b/>
           <w:spacing w:val="-15"/>
         </w:rPr>
-        <w:t> </w:t>
+        <w:t xml:space="preserve"> </w:t>
       </w:r>
       <w:r>
         <w:rPr>
@@ -1544,7 +1044,7 @@
           <w:b/>
           <w:spacing w:val="-16"/>
         </w:rPr>
-        <w:t> </w:t>
+        <w:t xml:space="preserve"> </w:t>
       </w:r>
       <w:r>
         <w:rPr>
@@ -1563,7 +1063,7 @@
         <w:rPr>
           <w:spacing w:val="-17"/>
         </w:rPr>
-        <w:t> </w:t>
+        <w:t xml:space="preserve"> </w:t>
       </w:r>
       <w:r>
         <w:rPr>
@@ -1575,7 +1075,7 @@
         <w:rPr>
           <w:spacing w:val="-15"/>
         </w:rPr>
-        <w:t> </w:t>
+        <w:t xml:space="preserve"> </w:t>
       </w:r>
       <w:r>
         <w:rPr>
@@ -1587,7 +1087,7 @@
         <w:rPr>
           <w:spacing w:val="-15"/>
         </w:rPr>
-        <w:t> </w:t>
+        <w:t xml:space="preserve"> </w:t>
       </w:r>
       <w:r>
         <w:rPr>
@@ -1599,7 +1099,7 @@
         <w:rPr>
           <w:spacing w:val="-15"/>
         </w:rPr>
-        <w:t> </w:t>
+        <w:t xml:space="preserve"> </w:t>
       </w:r>
       <w:r>
         <w:rPr>
@@ -1611,7 +1111,7 @@
         <w:rPr>
           <w:spacing w:val="-15"/>
         </w:rPr>
-        <w:t> </w:t>
+        <w:t xml:space="preserve"> </w:t>
       </w:r>
       <w:r>
         <w:rPr>
@@ -1623,23 +1123,22 @@
         <w:rPr>
           <w:spacing w:val="-16"/>
         </w:rPr>
-        <w:t> </w:t>
+        <w:t xml:space="preserve"> </w:t>
       </w:r>
       <w:r>
         <w:rPr>
           <w:spacing w:val="-4"/>
         </w:rPr>
-        <w:t>signature. </w:t>
-      </w:r>
-      <w:r>
-        <w:rPr/>
+        <w:t xml:space="preserve">signature. </w:t>
+      </w:r>
+      <w:r>
         <w:t>This</w:t>
       </w:r>
       <w:r>
         <w:rPr>
           <w:spacing w:val="-10"/>
         </w:rPr>
-        <w:t> </w:t>
+        <w:t xml:space="preserve"> </w:t>
       </w:r>
       <w:r>
         <w:rPr>
@@ -1648,8 +1147,7 @@
         <w:tab/>
       </w:r>
       <w:r>
-        <w:rPr/>
-        <w:t>day of </w:t>
+        <w:t xml:space="preserve">day of </w:t>
       </w:r>
       <w:r>
         <w:rPr>
@@ -1670,24 +1168,43 @@
         <w:tab/>
       </w:r>
       <w:r>
-        <w:rPr/>
         <w:t>, in (City/Country).</w:t>
       </w:r>
     </w:p>
     <w:sectPr>
-      <w:headerReference w:type="default" r:id="rId5"/>
-      <w:footerReference w:type="default" r:id="rId6"/>
+      <w:headerReference w:type="default" r:id="rId7"/>
+      <w:footerReference w:type="default" r:id="rId8"/>
       <w:type w:val="continuous"/>
       <w:pgSz w:w="11910" w:h="16840"/>
-      <w:pgMar w:header="539" w:footer="2275" w:top="1780" w:bottom="2460" w:left="1275" w:right="1417"/>
+      <w:pgMar w:top="1780" w:right="1417" w:bottom="2460" w:left="1275" w:header="539" w:footer="2275" w:gutter="0"/>
       <w:pgNumType w:start="1"/>
+      <w:cols w:space="720"/>
     </w:sectPr>
   </w:body>
 </w:document>
 </file>
 
+<file path=word/endnotes.xml><?xml version="1.0" encoding="utf-8"?>
+<w:endnotes xmlns:wpc="http://schemas.microsoft.com/office/word/2010/wordprocessingCanvas" xmlns:cx="http://schemas.microsoft.com/office/drawing/2014/chartex" xmlns:cx1="http://schemas.microsoft.com/office/drawing/2015/9/8/chartex" xmlns:cx2="http://schemas.microsoft.com/office/drawing/2015/10/21/chartex" xmlns:cx3="http://schemas.microsoft.com/office/drawing/2016/5/9/chartex" xmlns:cx4="http://schemas.microsoft.com/office/drawing/2016/5/10/chartex" xmlns:cx5="http://schemas.microsoft.com/office/drawing/2016/5/11/chartex" xmlns:cx6="http://schemas.microsoft.com/office/drawing/2016/5/12/chartex" xmlns:cx7="http://schemas.microsoft.com/office/drawing/2016/5/13/chartex" xmlns:cx8="http://schemas.microsoft.com/office/drawing/2016/5/14/chartex" xmlns:mc="http://schemas.openxmlformats.org/markup-compatibility/2006" xmlns:m="http://schemas.openxmlformats.org/officeDocument/2006/math" xmlns:aink="http://schemas.microsoft.com/office/drawing/2016/ink" xmlns:am3d="http://schemas.microsoft.com/office/drawing/2017/model3d" xmlns:oel="http://schemas.microsoft.com/office/2019/extlst" xmlns:r="http://schemas.openxmlformats.org/officeDocument/2006/relationships" xmlns:wp14="http://schemas.microsoft.com/office/word/2010/wordprocessingDrawing" xmlns:wp="http://schemas.openxmlformats.org/drawingml/2006/wordprocessingDrawing" xmlns:wpg="http://schemas.microsoft.com/office/word/2010/wordprocessingGroup" xmlns:wpi="http://schemas.microsoft.com/office/word/2010/wordprocessingInk" xmlns:wps="http://schemas.microsoft.com/office/word/2010/wordprocessingShape" xmlns:o="urn:schemas-microsoft-com:office:office" xmlns:v="urn:schemas-microsoft-com:vml" xmlns:w10="urn:schemas-microsoft-com:office:word" xmlns:w="http://schemas.openxmlformats.org/wordprocessingml/2006/main" xmlns:w14="http://schemas.microsoft.com/office/word/2010/wordml" xmlns:w15="http://schemas.microsoft.com/office/word/2012/wordml" xmlns:w16cex="http://schemas.microsoft.com/office/word/2018/wordml/cex" xmlns:w16cid="http://schemas.microsoft.com/office/word/2016/wordml/cid" xmlns:w16="http://schemas.microsoft.com/office/word/2018/wordml" xmlns:w16sdtdh="http://schemas.microsoft.com/office/word/2020/wordml/sdtdatahash" xmlns:w16sdtfl="http://schemas.microsoft.com/office/word/2024/wordml/sdtformatlock" xmlns:w16se="http://schemas.microsoft.com/office/word/2015/wordml/symex" xmlns:w16du="http://schemas.microsoft.com/office/word/2023/wordml/word16du" xmlns:wne="http://schemas.microsoft.com/office/word/2006/wordml" mc:Ignorable="w14 w15 w16se w16cid w16 w16cex w16sdtdh w16sdtfl w16du wp14">
+  <w:endnote w:type="separator" w:id="-1">
+    <w:p>
+      <w:r>
+        <w:separator/>
+      </w:r>
+    </w:p>
+  </w:endnote>
+  <w:endnote w:type="continuationSeparator" w:id="0">
+    <w:p>
+      <w:r>
+        <w:continuationSeparator/>
+      </w:r>
+    </w:p>
+  </w:endnote>
+</w:endnotes>
+</file>
+
 <file path=word/footer1.xml><?xml version="1.0" encoding="utf-8"?>
-<w:ftr xmlns:mc="http://schemas.openxmlformats.org/markup-compatibility/2006" xmlns:ve="http://schemas.openxmlformats.org/markup-compatibility/2006" xmlns:o="urn:schemas-microsoft-com:office:office" xmlns:r="http://schemas.openxmlformats.org/officeDocument/2006/relationships" xmlns:m="http://schemas.openxmlformats.org/officeDocument/2006/math" xmlns:v="urn:schemas-microsoft-com:vml" xmlns:wp="http://schemas.openxmlformats.org/drawingml/2006/wordprocessingDrawing" xmlns:w10="urn:schemas-microsoft-com:office:word" xmlns:w="http://schemas.openxmlformats.org/wordprocessingml/2006/main" xmlns:wne="http://schemas.microsoft.com/office/word/2006/wordml" xmlns:a="http://schemas.openxmlformats.org/drawingml/2006/main" xmlns:pic="http://schemas.openxmlformats.org/drawingml/2006/picture" xmlns:wpg="http://schemas.microsoft.com/office/word/2010/wordprocessingGroup" xmlns:wps="http://schemas.microsoft.com/office/word/2010/wordprocessingShape" xmlns:w14="http://schemas.microsoft.com/office/word/2010/wordml" mc:Ignorable="w14" xml:space="preserve">
+<w:ftr xmlns:wpc="http://schemas.microsoft.com/office/word/2010/wordprocessingCanvas" xmlns:cx="http://schemas.microsoft.com/office/drawing/2014/chartex" xmlns:cx1="http://schemas.microsoft.com/office/drawing/2015/9/8/chartex" xmlns:cx2="http://schemas.microsoft.com/office/drawing/2015/10/21/chartex" xmlns:cx3="http://schemas.microsoft.com/office/drawing/2016/5/9/chartex" xmlns:cx4="http://schemas.microsoft.com/office/drawing/2016/5/10/chartex" xmlns:cx5="http://schemas.microsoft.com/office/drawing/2016/5/11/chartex" xmlns:cx6="http://schemas.microsoft.com/office/drawing/2016/5/12/chartex" xmlns:cx7="http://schemas.microsoft.com/office/drawing/2016/5/13/chartex" xmlns:cx8="http://schemas.microsoft.com/office/drawing/2016/5/14/chartex" xmlns:mc="http://schemas.openxmlformats.org/markup-compatibility/2006" xmlns:m="http://schemas.openxmlformats.org/officeDocument/2006/math" xmlns:aink="http://schemas.microsoft.com/office/drawing/2016/ink" xmlns:am3d="http://schemas.microsoft.com/office/drawing/2017/model3d" xmlns:oel="http://schemas.microsoft.com/office/2019/extlst" xmlns:r="http://schemas.openxmlformats.org/officeDocument/2006/relationships" xmlns:wp14="http://schemas.microsoft.com/office/word/2010/wordprocessingDrawing" xmlns:wp="http://schemas.openxmlformats.org/drawingml/2006/wordprocessingDrawing" xmlns:wpg="http://schemas.microsoft.com/office/word/2010/wordprocessingGroup" xmlns:wpi="http://schemas.microsoft.com/office/word/2010/wordprocessingInk" xmlns:wps="http://schemas.microsoft.com/office/word/2010/wordprocessingShape" xmlns:o="urn:schemas-microsoft-com:office:office" xmlns:v="urn:schemas-microsoft-com:vml" xmlns:w10="urn:schemas-microsoft-com:office:word" xmlns:w="http://schemas.openxmlformats.org/wordprocessingml/2006/main" xmlns:w14="http://schemas.microsoft.com/office/word/2010/wordml" xmlns:w15="http://schemas.microsoft.com/office/word/2012/wordml" xmlns:w16cex="http://schemas.microsoft.com/office/word/2018/wordml/cex" xmlns:w16cid="http://schemas.microsoft.com/office/word/2016/wordml/cid" xmlns:w16="http://schemas.microsoft.com/office/word/2018/wordml" xmlns:w16sdtdh="http://schemas.microsoft.com/office/word/2020/wordml/sdtdatahash" xmlns:w16sdtfl="http://schemas.microsoft.com/office/word/2024/wordml/sdtformatlock" xmlns:w16se="http://schemas.microsoft.com/office/word/2015/wordml/symex" xmlns:w16du="http://schemas.microsoft.com/office/word/2023/wordml/word16du" xmlns:wne="http://schemas.microsoft.com/office/word/2006/wordml" mc:Ignorable="w14 w15 w16se w16cid w16 w16cex w16sdtdh w16sdtfl w16du wp14">
   <w:p>
     <w:pPr>
       <w:pStyle w:val="BodyText"/>
@@ -1698,12 +1215,13 @@
     </w:pPr>
     <w:r>
       <w:rPr>
+        <w:noProof/>
         <w:sz w:val="20"/>
       </w:rPr>
       <mc:AlternateContent>
         <mc:Choice Requires="wps">
           <w:drawing>
-            <wp:anchor distT="0" distB="0" distL="0" distR="0" allowOverlap="1" layoutInCell="1" locked="0" behindDoc="0" simplePos="0" relativeHeight="15728640">
+            <wp:anchor distT="0" distB="0" distL="0" distR="0" simplePos="0" relativeHeight="15728640" behindDoc="0" locked="0" layoutInCell="1" allowOverlap="1" wp14:anchorId="6BA8F91E" wp14:editId="4C69E2CB">
               <wp:simplePos x="0" y="0"/>
               <wp:positionH relativeFrom="page">
                 <wp:posOffset>844550</wp:posOffset>
@@ -1716,13 +1234,14 @@
               <wp:wrapNone/>
               <wp:docPr id="3" name="Textbox 3"/>
               <wp:cNvGraphicFramePr>
-                <a:graphicFrameLocks/>
+                <a:graphicFrameLocks xmlns:a="http://schemas.openxmlformats.org/drawingml/2006/main"/>
               </wp:cNvGraphicFramePr>
-              <a:graphic>
+              <a:graphic xmlns:a="http://schemas.openxmlformats.org/drawingml/2006/main">
                 <a:graphicData uri="http://schemas.microsoft.com/office/word/2010/wordprocessingShape">
                   <wps:wsp>
-                    <wps:cNvPr id="3" name="Textbox 3"/>
-                    <wps:cNvSpPr txBox="1"/>
+                    <wps:cNvSpPr txBox="1">
+                      <a:spLocks/>
+                    </wps:cNvSpPr>
                     <wps:spPr>
                       <a:xfrm>
                         <a:off x="0" y="0"/>
@@ -1737,24 +1256,13 @@
                         <w:tbl>
                           <w:tblPr>
                             <w:tblW w:w="0" w:type="auto"/>
-                            <w:jc w:val="left"/>
                             <w:tblInd w:w="67" w:type="dxa"/>
-                            <w:tblBorders>
-                              <w:top w:val="none" w:sz="0" w:space="0" w:color="auto"/>
-                              <w:left w:val="none" w:sz="0" w:space="0" w:color="auto"/>
-                              <w:bottom w:val="none" w:sz="0" w:space="0" w:color="auto"/>
-                              <w:right w:val="none" w:sz="0" w:space="0" w:color="auto"/>
-                              <w:insideH w:val="none" w:sz="0" w:space="0" w:color="auto"/>
-                              <w:insideV w:val="none" w:sz="0" w:space="0" w:color="auto"/>
-                            </w:tblBorders>
                             <w:tblLayout w:type="fixed"/>
                             <w:tblCellMar>
-                              <w:top w:w="0" w:type="dxa"/>
                               <w:left w:w="0" w:type="dxa"/>
-                              <w:bottom w:w="0" w:type="dxa"/>
                               <w:right w:w="0" w:type="dxa"/>
                             </w:tblCellMar>
-                            <w:tblLook w:val="01E0"/>
+                            <w:tblLook w:val="01E0" w:firstRow="1" w:lastRow="1" w:firstColumn="1" w:lastColumn="1" w:noHBand="0" w:noVBand="0"/>
                           </w:tblPr>
                           <w:tblGrid>
                             <w:gridCol w:w="4394"/>
@@ -1762,7 +1270,7 @@
                           </w:tblGrid>
                           <w:tr>
                             <w:trPr>
-                              <w:trHeight w:val="1073" w:hRule="atLeast"/>
+                              <w:trHeight w:val="1073"/>
                             </w:trPr>
                             <w:tc>
                               <w:tcPr>
@@ -1775,7 +1283,6 @@
                                   <w:jc w:val="left"/>
                                   <w:rPr>
                                     <w:rFonts w:ascii="Times New Roman"/>
-                                    <w:sz w:val="22"/>
                                   </w:rPr>
                                 </w:pPr>
                               </w:p>
@@ -1786,19 +1293,14 @@
                                   <w:ind w:right="91"/>
                                   <w:rPr>
                                     <w:i/>
-                                    <w:sz w:val="22"/>
                                   </w:rPr>
                                 </w:pPr>
-                                <w:bookmarkStart w:name="KNOW ALL MEN BY THESE PRESENTS:" w:id="1"/>
-                                <w:bookmarkEnd w:id="1"/>
-                                <w:r>
-                                  <w:rPr/>
-                                </w:r>
+                                <w:bookmarkStart w:id="0" w:name="KNOW_ALL_MEN_BY_THESE_PRESENTS:"/>
+                                <w:bookmarkEnd w:id="0"/>
                                 <w:r>
                                   <w:rPr>
                                     <w:i/>
                                     <w:spacing w:val="-4"/>
-                                    <w:sz w:val="22"/>
                                   </w:rPr>
                                   <w:t>(Signature</w:t>
                                 </w:r>
@@ -1806,15 +1308,13 @@
                                   <w:rPr>
                                     <w:i/>
                                     <w:spacing w:val="-10"/>
-                                    <w:sz w:val="22"/>
-                                  </w:rPr>
-                                  <w:t> </w:t>
+                                  </w:rPr>
+                                  <w:t xml:space="preserve"> </w:t>
                                 </w:r>
                                 <w:r>
                                   <w:rPr>
                                     <w:i/>
                                     <w:spacing w:val="-4"/>
-                                    <w:sz w:val="22"/>
                                   </w:rPr>
                                   <w:t>over</w:t>
                                 </w:r>
@@ -1822,15 +1322,13 @@
                                   <w:rPr>
                                     <w:i/>
                                     <w:spacing w:val="-10"/>
-                                    <w:sz w:val="22"/>
-                                  </w:rPr>
-                                  <w:t> </w:t>
+                                  </w:rPr>
+                                  <w:t xml:space="preserve"> </w:t>
                                 </w:r>
                                 <w:r>
                                   <w:rPr>
                                     <w:i/>
                                     <w:spacing w:val="-4"/>
-                                    <w:sz w:val="22"/>
                                   </w:rPr>
                                   <w:t>printed</w:t>
                                 </w:r>
@@ -1838,15 +1336,13 @@
                                   <w:rPr>
                                     <w:i/>
                                     <w:spacing w:val="-9"/>
-                                    <w:sz w:val="22"/>
-                                  </w:rPr>
-                                  <w:t> </w:t>
+                                  </w:rPr>
+                                  <w:t xml:space="preserve"> </w:t>
                                 </w:r>
                                 <w:r>
                                   <w:rPr>
                                     <w:i/>
                                     <w:spacing w:val="-4"/>
-                                    <w:sz w:val="22"/>
                                   </w:rPr>
                                   <w:t>name</w:t>
                                 </w:r>
@@ -1854,15 +1350,13 @@
                                   <w:rPr>
                                     <w:i/>
                                     <w:spacing w:val="-10"/>
-                                    <w:sz w:val="22"/>
-                                  </w:rPr>
-                                  <w:t> </w:t>
+                                  </w:rPr>
+                                  <w:t xml:space="preserve"> </w:t>
                                 </w:r>
                                 <w:r>
                                   <w:rPr>
                                     <w:i/>
                                     <w:spacing w:val="-4"/>
-                                    <w:sz w:val="22"/>
                                   </w:rPr>
                                   <w:t>of</w:t>
                                 </w:r>
@@ -1870,22 +1364,19 @@
                                   <w:rPr>
                                     <w:i/>
                                     <w:spacing w:val="-9"/>
-                                    <w:sz w:val="22"/>
-                                  </w:rPr>
-                                  <w:t> </w:t>
+                                  </w:rPr>
+                                  <w:t xml:space="preserve"> </w:t>
                                 </w:r>
                                 <w:r>
                                   <w:rPr>
                                     <w:i/>
                                     <w:spacing w:val="-4"/>
-                                    <w:sz w:val="22"/>
-                                  </w:rPr>
-                                  <w:t>President/ </w:t>
-                                </w:r>
-                                <w:r>
-                                  <w:rPr>
-                                    <w:i/>
-                                    <w:sz w:val="22"/>
+                                  </w:rPr>
+                                  <w:t xml:space="preserve">President/ </w:t>
+                                </w:r>
+                                <w:r>
+                                  <w:rPr>
+                                    <w:i/>
                                   </w:rPr>
                                   <w:t>Manager of Phil. Agency)</w:t>
                                 </w:r>
@@ -1893,18 +1384,16 @@
                               <w:p>
                                 <w:pPr>
                                   <w:pStyle w:val="TableParagraph"/>
-                                  <w:spacing w:line="249" w:lineRule="exact" w:before="4"/>
+                                  <w:spacing w:before="4" w:line="249" w:lineRule="exact"/>
                                   <w:ind w:left="2" w:right="91"/>
                                   <w:rPr>
                                     <w:i/>
-                                    <w:sz w:val="22"/>
                                   </w:rPr>
                                 </w:pPr>
                                 <w:r>
                                   <w:rPr>
                                     <w:i/>
                                     <w:spacing w:val="-4"/>
-                                    <w:sz w:val="22"/>
                                   </w:rPr>
                                   <w:t>(Name</w:t>
                                 </w:r>
@@ -1912,15 +1401,13 @@
                                   <w:rPr>
                                     <w:i/>
                                     <w:spacing w:val="-10"/>
-                                    <w:sz w:val="22"/>
-                                  </w:rPr>
-                                  <w:t> </w:t>
+                                  </w:rPr>
+                                  <w:t xml:space="preserve"> </w:t>
                                 </w:r>
                                 <w:r>
                                   <w:rPr>
                                     <w:i/>
                                     <w:spacing w:val="-4"/>
-                                    <w:sz w:val="22"/>
                                   </w:rPr>
                                   <w:t>of</w:t>
                                 </w:r>
@@ -1928,15 +1415,13 @@
                                   <w:rPr>
                                     <w:i/>
                                     <w:spacing w:val="-6"/>
-                                    <w:sz w:val="22"/>
-                                  </w:rPr>
-                                  <w:t> </w:t>
+                                  </w:rPr>
+                                  <w:t xml:space="preserve"> </w:t>
                                 </w:r>
                                 <w:r>
                                   <w:rPr>
                                     <w:i/>
                                     <w:spacing w:val="-4"/>
-                                    <w:sz w:val="22"/>
                                   </w:rPr>
                                   <w:t>Philippine</w:t>
                                 </w:r>
@@ -1944,15 +1429,13 @@
                                   <w:rPr>
                                     <w:i/>
                                     <w:spacing w:val="-9"/>
-                                    <w:sz w:val="22"/>
-                                  </w:rPr>
-                                  <w:t> </w:t>
+                                  </w:rPr>
+                                  <w:t xml:space="preserve"> </w:t>
                                 </w:r>
                                 <w:r>
                                   <w:rPr>
                                     <w:i/>
                                     <w:spacing w:val="-4"/>
-                                    <w:sz w:val="22"/>
                                   </w:rPr>
                                   <w:t>agency)</w:t>
                                 </w:r>
@@ -1969,7 +1452,6 @@
                                   <w:jc w:val="left"/>
                                   <w:rPr>
                                     <w:rFonts w:ascii="Times New Roman"/>
-                                    <w:sz w:val="22"/>
                                   </w:rPr>
                                 </w:pPr>
                               </w:p>
@@ -1980,14 +1462,12 @@
                                   <w:ind w:left="203"/>
                                   <w:rPr>
                                     <w:i/>
-                                    <w:sz w:val="22"/>
                                   </w:rPr>
                                 </w:pPr>
                                 <w:r>
                                   <w:rPr>
                                     <w:i/>
                                     <w:spacing w:val="-4"/>
-                                    <w:sz w:val="22"/>
                                   </w:rPr>
                                   <w:t>(Signature</w:t>
                                 </w:r>
@@ -1995,15 +1475,13 @@
                                   <w:rPr>
                                     <w:i/>
                                     <w:spacing w:val="-12"/>
-                                    <w:sz w:val="22"/>
-                                  </w:rPr>
-                                  <w:t> </w:t>
+                                  </w:rPr>
+                                  <w:t xml:space="preserve"> </w:t>
                                 </w:r>
                                 <w:r>
                                   <w:rPr>
                                     <w:i/>
                                     <w:spacing w:val="-4"/>
-                                    <w:sz w:val="22"/>
                                   </w:rPr>
                                   <w:t>over</w:t>
                                 </w:r>
@@ -2011,15 +1489,13 @@
                                   <w:rPr>
                                     <w:i/>
                                     <w:spacing w:val="-12"/>
-                                    <w:sz w:val="22"/>
-                                  </w:rPr>
-                                  <w:t> </w:t>
+                                  </w:rPr>
+                                  <w:t xml:space="preserve"> </w:t>
                                 </w:r>
                                 <w:r>
                                   <w:rPr>
                                     <w:i/>
                                     <w:spacing w:val="-4"/>
-                                    <w:sz w:val="22"/>
                                   </w:rPr>
                                   <w:t>printed</w:t>
                                 </w:r>
@@ -2027,15 +1503,13 @@
                                   <w:rPr>
                                     <w:i/>
                                     <w:spacing w:val="-11"/>
-                                    <w:sz w:val="22"/>
-                                  </w:rPr>
-                                  <w:t> </w:t>
+                                  </w:rPr>
+                                  <w:t xml:space="preserve"> </w:t>
                                 </w:r>
                                 <w:r>
                                   <w:rPr>
                                     <w:i/>
                                     <w:spacing w:val="-4"/>
-                                    <w:sz w:val="22"/>
                                   </w:rPr>
                                   <w:t>name</w:t>
                                 </w:r>
@@ -2043,15 +1517,13 @@
                                   <w:rPr>
                                     <w:i/>
                                     <w:spacing w:val="-12"/>
-                                    <w:sz w:val="22"/>
-                                  </w:rPr>
-                                  <w:t> </w:t>
+                                  </w:rPr>
+                                  <w:t xml:space="preserve"> </w:t>
                                 </w:r>
                                 <w:r>
                                   <w:rPr>
                                     <w:i/>
                                     <w:spacing w:val="-4"/>
-                                    <w:sz w:val="22"/>
                                   </w:rPr>
                                   <w:t>of</w:t>
                                 </w:r>
@@ -2059,41 +1531,44 @@
                                   <w:rPr>
                                     <w:i/>
                                     <w:spacing w:val="-11"/>
-                                    <w:sz w:val="22"/>
-                                  </w:rPr>
-                                  <w:t> </w:t>
+                                  </w:rPr>
+                                  <w:t xml:space="preserve"> </w:t>
                                 </w:r>
                                 <w:r>
                                   <w:rPr>
                                     <w:i/>
                                     <w:spacing w:val="-4"/>
-                                    <w:sz w:val="22"/>
-                                  </w:rPr>
-                                  <w:t>Employer/ </w:t>
-                                </w:r>
-                                <w:r>
-                                  <w:rPr>
-                                    <w:i/>
-                                    <w:sz w:val="22"/>
-                                  </w:rPr>
-                                  <w:t>authorized signatory )</w:t>
-                                </w:r>
+                                  </w:rPr>
+                                  <w:t xml:space="preserve">Employer/ </w:t>
+                                </w:r>
+                                <w:r>
+                                  <w:rPr>
+                                    <w:i/>
+                                  </w:rPr>
+                                  <w:t xml:space="preserve">authorized </w:t>
+                                </w:r>
+                                <w:proofErr w:type="gramStart"/>
+                                <w:r>
+                                  <w:rPr>
+                                    <w:i/>
+                                  </w:rPr>
+                                  <w:t>signatory )</w:t>
+                                </w:r>
+                                <w:proofErr w:type="gramEnd"/>
                               </w:p>
                               <w:p>
                                 <w:pPr>
                                   <w:pStyle w:val="TableParagraph"/>
-                                  <w:spacing w:line="249" w:lineRule="exact" w:before="4"/>
+                                  <w:spacing w:before="4" w:line="249" w:lineRule="exact"/>
                                   <w:ind w:left="203" w:right="1"/>
                                   <w:rPr>
                                     <w:i/>
-                                    <w:sz w:val="22"/>
                                   </w:rPr>
                                 </w:pPr>
                                 <w:r>
                                   <w:rPr>
                                     <w:i/>
                                     <w:spacing w:val="-4"/>
-                                    <w:sz w:val="22"/>
                                   </w:rPr>
                                   <w:t>(Name</w:t>
                                 </w:r>
@@ -2101,15 +1576,13 @@
                                   <w:rPr>
                                     <w:i/>
                                     <w:spacing w:val="-16"/>
-                                    <w:sz w:val="22"/>
-                                  </w:rPr>
-                                  <w:t> </w:t>
+                                  </w:rPr>
+                                  <w:t xml:space="preserve"> </w:t>
                                 </w:r>
                                 <w:r>
                                   <w:rPr>
                                     <w:i/>
                                     <w:spacing w:val="-4"/>
-                                    <w:sz w:val="22"/>
                                   </w:rPr>
                                   <w:t>of</w:t>
                                 </w:r>
@@ -2117,15 +1590,13 @@
                                   <w:rPr>
                                     <w:i/>
                                     <w:spacing w:val="-14"/>
-                                    <w:sz w:val="22"/>
-                                  </w:rPr>
-                                  <w:t> </w:t>
+                                  </w:rPr>
+                                  <w:t xml:space="preserve"> </w:t>
                                 </w:r>
                                 <w:r>
                                   <w:rPr>
                                     <w:i/>
                                     <w:spacing w:val="-4"/>
-                                    <w:sz w:val="22"/>
                                   </w:rPr>
                                   <w:t>company)</w:t>
                                 </w:r>
@@ -2151,30 +1622,23 @@
         </mc:Choice>
         <mc:Fallback>
           <w:pict>
-            <v:shape style="position:absolute;margin-left:66.5pt;margin-top:718.153809pt;width:439.95pt;height:53.65pt;mso-position-horizontal-relative:page;mso-position-vertical-relative:page;z-index:15728640" type="#_x0000_t202" id="docshape3" filled="false" stroked="false">
+            <v:shapetype w14:anchorId="6BA8F91E" id="_x0000_t202" coordsize="21600,21600" o:spt="202" path="m,l,21600r21600,l21600,xe">
+              <v:stroke joinstyle="miter"/>
+              <v:path gradientshapeok="t" o:connecttype="rect"/>
+            </v:shapetype>
+            <v:shape id="Textbox 3" o:spid="_x0000_s1028" type="#_x0000_t202" style="position:absolute;margin-left:66.5pt;margin-top:718.15pt;width:439.95pt;height:53.65pt;z-index:15728640;visibility:visible;mso-wrap-style:square;mso-wrap-distance-left:0;mso-wrap-distance-top:0;mso-wrap-distance-right:0;mso-wrap-distance-bottom:0;mso-position-horizontal:absolute;mso-position-horizontal-relative:page;mso-position-vertical:absolute;mso-position-vertical-relative:page;v-text-anchor:top" o:gfxdata="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" filled="f" stroked="f">
               <v:textbox inset="0,0,0,0">
                 <w:txbxContent>
                   <w:tbl>
                     <w:tblPr>
                       <w:tblW w:w="0" w:type="auto"/>
-                      <w:jc w:val="left"/>
                       <w:tblInd w:w="67" w:type="dxa"/>
-                      <w:tblBorders>
-                        <w:top w:val="none" w:sz="0" w:space="0" w:color="auto"/>
-                        <w:left w:val="none" w:sz="0" w:space="0" w:color="auto"/>
-                        <w:bottom w:val="none" w:sz="0" w:space="0" w:color="auto"/>
-                        <w:right w:val="none" w:sz="0" w:space="0" w:color="auto"/>
-                        <w:insideH w:val="none" w:sz="0" w:space="0" w:color="auto"/>
-                        <w:insideV w:val="none" w:sz="0" w:space="0" w:color="auto"/>
-                      </w:tblBorders>
                       <w:tblLayout w:type="fixed"/>
                       <w:tblCellMar>
-                        <w:top w:w="0" w:type="dxa"/>
                         <w:left w:w="0" w:type="dxa"/>
-                        <w:bottom w:w="0" w:type="dxa"/>
                         <w:right w:w="0" w:type="dxa"/>
                       </w:tblCellMar>
-                      <w:tblLook w:val="01E0"/>
+                      <w:tblLook w:val="01E0" w:firstRow="1" w:lastRow="1" w:firstColumn="1" w:lastColumn="1" w:noHBand="0" w:noVBand="0"/>
                     </w:tblPr>
                     <w:tblGrid>
                       <w:gridCol w:w="4394"/>
@@ -2182,7 +1646,7 @@
                     </w:tblGrid>
                     <w:tr>
                       <w:trPr>
-                        <w:trHeight w:val="1073" w:hRule="atLeast"/>
+                        <w:trHeight w:val="1073"/>
                       </w:trPr>
                       <w:tc>
                         <w:tcPr>
@@ -2195,7 +1659,6 @@
                             <w:jc w:val="left"/>
                             <w:rPr>
                               <w:rFonts w:ascii="Times New Roman"/>
-                              <w:sz w:val="22"/>
                             </w:rPr>
                           </w:pPr>
                         </w:p>
@@ -2206,19 +1669,14 @@
                             <w:ind w:right="91"/>
                             <w:rPr>
                               <w:i/>
-                              <w:sz w:val="22"/>
                             </w:rPr>
                           </w:pPr>
-                          <w:bookmarkStart w:name="KNOW ALL MEN BY THESE PRESENTS:" w:id="2"/>
-                          <w:bookmarkEnd w:id="2"/>
-                          <w:r>
-                            <w:rPr/>
-                          </w:r>
+                          <w:bookmarkStart w:id="1" w:name="KNOW_ALL_MEN_BY_THESE_PRESENTS:"/>
+                          <w:bookmarkEnd w:id="1"/>
                           <w:r>
                             <w:rPr>
                               <w:i/>
                               <w:spacing w:val="-4"/>
-                              <w:sz w:val="22"/>
                             </w:rPr>
                             <w:t>(Signature</w:t>
                           </w:r>
@@ -2226,15 +1684,13 @@
                             <w:rPr>
                               <w:i/>
                               <w:spacing w:val="-10"/>
-                              <w:sz w:val="22"/>
-                            </w:rPr>
-                            <w:t> </w:t>
+                            </w:rPr>
+                            <w:t xml:space="preserve"> </w:t>
                           </w:r>
                           <w:r>
                             <w:rPr>
                               <w:i/>
                               <w:spacing w:val="-4"/>
-                              <w:sz w:val="22"/>
                             </w:rPr>
                             <w:t>over</w:t>
                           </w:r>
@@ -2242,15 +1698,13 @@
                             <w:rPr>
                               <w:i/>
                               <w:spacing w:val="-10"/>
-                              <w:sz w:val="22"/>
-                            </w:rPr>
-                            <w:t> </w:t>
+                            </w:rPr>
+                            <w:t xml:space="preserve"> </w:t>
                           </w:r>
                           <w:r>
                             <w:rPr>
                               <w:i/>
                               <w:spacing w:val="-4"/>
-                              <w:sz w:val="22"/>
                             </w:rPr>
                             <w:t>printed</w:t>
                           </w:r>
@@ -2258,15 +1712,13 @@
                             <w:rPr>
                               <w:i/>
                               <w:spacing w:val="-9"/>
-                              <w:sz w:val="22"/>
-                            </w:rPr>
-                            <w:t> </w:t>
+                            </w:rPr>
+                            <w:t xml:space="preserve"> </w:t>
                           </w:r>
                           <w:r>
                             <w:rPr>
                               <w:i/>
                               <w:spacing w:val="-4"/>
-                              <w:sz w:val="22"/>
                             </w:rPr>
                             <w:t>name</w:t>
                           </w:r>
@@ -2274,15 +1726,13 @@
                             <w:rPr>
                               <w:i/>
                               <w:spacing w:val="-10"/>
-                              <w:sz w:val="22"/>
-                            </w:rPr>
-                            <w:t> </w:t>
+                            </w:rPr>
+                            <w:t xml:space="preserve"> </w:t>
                           </w:r>
                           <w:r>
                             <w:rPr>
                               <w:i/>
                               <w:spacing w:val="-4"/>
-                              <w:sz w:val="22"/>
                             </w:rPr>
                             <w:t>of</w:t>
                           </w:r>
@@ -2290,22 +1740,19 @@
                             <w:rPr>
                               <w:i/>
                               <w:spacing w:val="-9"/>
-                              <w:sz w:val="22"/>
-                            </w:rPr>
-                            <w:t> </w:t>
+                            </w:rPr>
+                            <w:t xml:space="preserve"> </w:t>
                           </w:r>
                           <w:r>
                             <w:rPr>
                               <w:i/>
                               <w:spacing w:val="-4"/>
-                              <w:sz w:val="22"/>
-                            </w:rPr>
-                            <w:t>President/ </w:t>
-                          </w:r>
-                          <w:r>
-                            <w:rPr>
-                              <w:i/>
-                              <w:sz w:val="22"/>
+                            </w:rPr>
+                            <w:t xml:space="preserve">President/ </w:t>
+                          </w:r>
+                          <w:r>
+                            <w:rPr>
+                              <w:i/>
                             </w:rPr>
                             <w:t>Manager of Phil. Agency)</w:t>
                           </w:r>
@@ -2313,18 +1760,16 @@
                         <w:p>
                           <w:pPr>
                             <w:pStyle w:val="TableParagraph"/>
-                            <w:spacing w:line="249" w:lineRule="exact" w:before="4"/>
+                            <w:spacing w:before="4" w:line="249" w:lineRule="exact"/>
                             <w:ind w:left="2" w:right="91"/>
                             <w:rPr>
                               <w:i/>
-                              <w:sz w:val="22"/>
                             </w:rPr>
                           </w:pPr>
                           <w:r>
                             <w:rPr>
                               <w:i/>
                               <w:spacing w:val="-4"/>
-                              <w:sz w:val="22"/>
                             </w:rPr>
                             <w:t>(Name</w:t>
                           </w:r>
@@ -2332,15 +1777,13 @@
                             <w:rPr>
                               <w:i/>
                               <w:spacing w:val="-10"/>
-                              <w:sz w:val="22"/>
-                            </w:rPr>
-                            <w:t> </w:t>
+                            </w:rPr>
+                            <w:t xml:space="preserve"> </w:t>
                           </w:r>
                           <w:r>
                             <w:rPr>
                               <w:i/>
                               <w:spacing w:val="-4"/>
-                              <w:sz w:val="22"/>
                             </w:rPr>
                             <w:t>of</w:t>
                           </w:r>
@@ -2348,15 +1791,13 @@
                             <w:rPr>
                               <w:i/>
                               <w:spacing w:val="-6"/>
-                              <w:sz w:val="22"/>
-                            </w:rPr>
-                            <w:t> </w:t>
+                            </w:rPr>
+                            <w:t xml:space="preserve"> </w:t>
                           </w:r>
                           <w:r>
                             <w:rPr>
                               <w:i/>
                               <w:spacing w:val="-4"/>
-                              <w:sz w:val="22"/>
                             </w:rPr>
                             <w:t>Philippine</w:t>
                           </w:r>
@@ -2364,15 +1805,13 @@
                             <w:rPr>
                               <w:i/>
                               <w:spacing w:val="-9"/>
-                              <w:sz w:val="22"/>
-                            </w:rPr>
-                            <w:t> </w:t>
+                            </w:rPr>
+                            <w:t xml:space="preserve"> </w:t>
                           </w:r>
                           <w:r>
                             <w:rPr>
                               <w:i/>
                               <w:spacing w:val="-4"/>
-                              <w:sz w:val="22"/>
                             </w:rPr>
                             <w:t>agency)</w:t>
                           </w:r>
@@ -2389,7 +1828,6 @@
                             <w:jc w:val="left"/>
                             <w:rPr>
                               <w:rFonts w:ascii="Times New Roman"/>
-                              <w:sz w:val="22"/>
                             </w:rPr>
                           </w:pPr>
                         </w:p>
@@ -2400,14 +1838,12 @@
                             <w:ind w:left="203"/>
                             <w:rPr>
                               <w:i/>
-                              <w:sz w:val="22"/>
                             </w:rPr>
                           </w:pPr>
                           <w:r>
                             <w:rPr>
                               <w:i/>
                               <w:spacing w:val="-4"/>
-                              <w:sz w:val="22"/>
                             </w:rPr>
                             <w:t>(Signature</w:t>
                           </w:r>
@@ -2415,15 +1851,13 @@
                             <w:rPr>
                               <w:i/>
                               <w:spacing w:val="-12"/>
-                              <w:sz w:val="22"/>
-                            </w:rPr>
-                            <w:t> </w:t>
+                            </w:rPr>
+                            <w:t xml:space="preserve"> </w:t>
                           </w:r>
                           <w:r>
                             <w:rPr>
                               <w:i/>
                               <w:spacing w:val="-4"/>
-                              <w:sz w:val="22"/>
                             </w:rPr>
                             <w:t>over</w:t>
                           </w:r>
@@ -2431,15 +1865,13 @@
                             <w:rPr>
                               <w:i/>
                               <w:spacing w:val="-12"/>
-                              <w:sz w:val="22"/>
-                            </w:rPr>
-                            <w:t> </w:t>
+                            </w:rPr>
+                            <w:t xml:space="preserve"> </w:t>
                           </w:r>
                           <w:r>
                             <w:rPr>
                               <w:i/>
                               <w:spacing w:val="-4"/>
-                              <w:sz w:val="22"/>
                             </w:rPr>
                             <w:t>printed</w:t>
                           </w:r>
@@ -2447,15 +1879,13 @@
                             <w:rPr>
                               <w:i/>
                               <w:spacing w:val="-11"/>
-                              <w:sz w:val="22"/>
-                            </w:rPr>
-                            <w:t> </w:t>
+                            </w:rPr>
+                            <w:t xml:space="preserve"> </w:t>
                           </w:r>
                           <w:r>
                             <w:rPr>
                               <w:i/>
                               <w:spacing w:val="-4"/>
-                              <w:sz w:val="22"/>
                             </w:rPr>
                             <w:t>name</w:t>
                           </w:r>
@@ -2463,15 +1893,13 @@
                             <w:rPr>
                               <w:i/>
                               <w:spacing w:val="-12"/>
-                              <w:sz w:val="22"/>
-                            </w:rPr>
-                            <w:t> </w:t>
+                            </w:rPr>
+                            <w:t xml:space="preserve"> </w:t>
                           </w:r>
                           <w:r>
                             <w:rPr>
                               <w:i/>
                               <w:spacing w:val="-4"/>
-                              <w:sz w:val="22"/>
                             </w:rPr>
                             <w:t>of</w:t>
                           </w:r>
@@ -2479,41 +1907,44 @@
                             <w:rPr>
                               <w:i/>
                               <w:spacing w:val="-11"/>
-                              <w:sz w:val="22"/>
-                            </w:rPr>
-                            <w:t> </w:t>
+                            </w:rPr>
+                            <w:t xml:space="preserve"> </w:t>
                           </w:r>
                           <w:r>
                             <w:rPr>
                               <w:i/>
                               <w:spacing w:val="-4"/>
-                              <w:sz w:val="22"/>
-                            </w:rPr>
-                            <w:t>Employer/ </w:t>
-                          </w:r>
-                          <w:r>
-                            <w:rPr>
-                              <w:i/>
-                              <w:sz w:val="22"/>
-                            </w:rPr>
-                            <w:t>authorized signatory )</w:t>
-                          </w:r>
+                            </w:rPr>
+                            <w:t xml:space="preserve">Employer/ </w:t>
+                          </w:r>
+                          <w:r>
+                            <w:rPr>
+                              <w:i/>
+                            </w:rPr>
+                            <w:t xml:space="preserve">authorized </w:t>
+                          </w:r>
+                          <w:proofErr w:type="gramStart"/>
+                          <w:r>
+                            <w:rPr>
+                              <w:i/>
+                            </w:rPr>
+                            <w:t>signatory )</w:t>
+                          </w:r>
+                          <w:proofErr w:type="gramEnd"/>
                         </w:p>
                         <w:p>
                           <w:pPr>
                             <w:pStyle w:val="TableParagraph"/>
-                            <w:spacing w:line="249" w:lineRule="exact" w:before="4"/>
+                            <w:spacing w:before="4" w:line="249" w:lineRule="exact"/>
                             <w:ind w:left="203" w:right="1"/>
                             <w:rPr>
                               <w:i/>
-                              <w:sz w:val="22"/>
                             </w:rPr>
                           </w:pPr>
                           <w:r>
                             <w:rPr>
                               <w:i/>
                               <w:spacing w:val="-4"/>
-                              <w:sz w:val="22"/>
                             </w:rPr>
                             <w:t>(Name</w:t>
                           </w:r>
@@ -2521,15 +1952,13 @@
                             <w:rPr>
                               <w:i/>
                               <w:spacing w:val="-16"/>
-                              <w:sz w:val="22"/>
-                            </w:rPr>
-                            <w:t> </w:t>
+                            </w:rPr>
+                            <w:t xml:space="preserve"> </w:t>
                           </w:r>
                           <w:r>
                             <w:rPr>
                               <w:i/>
                               <w:spacing w:val="-4"/>
-                              <w:sz w:val="22"/>
                             </w:rPr>
                             <w:t>of</w:t>
                           </w:r>
@@ -2537,15 +1966,13 @@
                             <w:rPr>
                               <w:i/>
                               <w:spacing w:val="-14"/>
-                              <w:sz w:val="22"/>
-                            </w:rPr>
-                            <w:t> </w:t>
+                            </w:rPr>
+                            <w:t xml:space="preserve"> </w:t>
                           </w:r>
                           <w:r>
                             <w:rPr>
                               <w:i/>
                               <w:spacing w:val="-4"/>
-                              <w:sz w:val="22"/>
                             </w:rPr>
                             <w:t>company)</w:t>
                           </w:r>
@@ -2560,7 +1987,7 @@
                   </w:p>
                 </w:txbxContent>
               </v:textbox>
-              <w10:wrap type="none"/>
+              <w10:wrap anchorx="page" anchory="page"/>
             </v:shape>
           </w:pict>
         </mc:Fallback>
@@ -2568,12 +1995,13 @@
     </w:r>
     <w:r>
       <w:rPr>
+        <w:noProof/>
         <w:sz w:val="20"/>
       </w:rPr>
       <mc:AlternateContent>
         <mc:Choice Requires="wps">
           <w:drawing>
-            <wp:anchor distT="0" distB="0" distL="0" distR="0" allowOverlap="1" layoutInCell="1" locked="0" behindDoc="1" simplePos="0" relativeHeight="487550464">
+            <wp:anchor distT="0" distB="0" distL="0" distR="0" simplePos="0" relativeHeight="487550464" behindDoc="1" locked="0" layoutInCell="1" allowOverlap="1" wp14:anchorId="152E6489" wp14:editId="2FD386A1">
               <wp:simplePos x="0" y="0"/>
               <wp:positionH relativeFrom="page">
                 <wp:posOffset>914400</wp:posOffset>
@@ -2586,13 +2014,14 @@
               <wp:wrapNone/>
               <wp:docPr id="4" name="Graphic 4"/>
               <wp:cNvGraphicFramePr>
-                <a:graphicFrameLocks/>
+                <a:graphicFrameLocks xmlns:a="http://schemas.openxmlformats.org/drawingml/2006/main"/>
               </wp:cNvGraphicFramePr>
-              <a:graphic>
+              <a:graphic xmlns:a="http://schemas.openxmlformats.org/drawingml/2006/main">
                 <a:graphicData uri="http://schemas.microsoft.com/office/word/2010/wordprocessingShape">
                   <wps:wsp>
-                    <wps:cNvPr id="4" name="Graphic 4"/>
-                    <wps:cNvSpPr/>
+                    <wps:cNvSpPr>
+                      <a:spLocks/>
+                    </wps:cNvSpPr>
                     <wps:spPr>
                       <a:xfrm>
                         <a:off x="0" y="0"/>
@@ -2605,7 +2034,7 @@
                         <a:cxnLst/>
                         <a:rect l="l" t="t" r="r" b="b"/>
                         <a:pathLst>
-                          <a:path w="2055495" h="0">
+                          <a:path w="2055495">
                             <a:moveTo>
                               <a:pt x="0" y="0"/>
                             </a:moveTo>
@@ -2634,7 +2063,7 @@
             </wp:anchor>
           </w:drawing>
         </mc:Choice>
-        <mc:Fallback>
+        <mc:Fallback xmlns:pic="http://schemas.openxmlformats.org/drawingml/2006/picture" xmlns:a="http://schemas.openxmlformats.org/drawingml/2006/main" xmlns:ve="http://schemas.openxmlformats.org/markup-compatibility/2006">
           <w:pict>
             <v:line style="position:absolute;mso-position-horizontal-relative:page;mso-position-vertical-relative:page;z-index:-15766016" from="72pt,729.537842pt" to="233.830521pt,729.537842pt" stroked="true" strokeweight=".512153pt" strokecolor="#000000">
               <v:stroke dashstyle="solid"/>
@@ -2646,12 +2075,13 @@
     </w:r>
     <w:r>
       <w:rPr>
+        <w:noProof/>
         <w:sz w:val="20"/>
       </w:rPr>
       <mc:AlternateContent>
         <mc:Choice Requires="wps">
           <w:drawing>
-            <wp:anchor distT="0" distB="0" distL="0" distR="0" allowOverlap="1" layoutInCell="1" locked="0" behindDoc="1" simplePos="0" relativeHeight="487550976">
+            <wp:anchor distT="0" distB="0" distL="0" distR="0" simplePos="0" relativeHeight="487550976" behindDoc="1" locked="0" layoutInCell="1" allowOverlap="1" wp14:anchorId="60E0A46E" wp14:editId="2510F6EA">
               <wp:simplePos x="0" y="0"/>
               <wp:positionH relativeFrom="page">
                 <wp:posOffset>4003547</wp:posOffset>
@@ -2664,13 +2094,14 @@
               <wp:wrapNone/>
               <wp:docPr id="5" name="Graphic 5"/>
               <wp:cNvGraphicFramePr>
-                <a:graphicFrameLocks/>
+                <a:graphicFrameLocks xmlns:a="http://schemas.openxmlformats.org/drawingml/2006/main"/>
               </wp:cNvGraphicFramePr>
-              <a:graphic>
+              <a:graphic xmlns:a="http://schemas.openxmlformats.org/drawingml/2006/main">
                 <a:graphicData uri="http://schemas.microsoft.com/office/word/2010/wordprocessingShape">
                   <wps:wsp>
-                    <wps:cNvPr id="5" name="Graphic 5"/>
-                    <wps:cNvSpPr/>
+                    <wps:cNvSpPr>
+                      <a:spLocks/>
+                    </wps:cNvSpPr>
                     <wps:spPr>
                       <a:xfrm>
                         <a:off x="0" y="0"/>
@@ -2683,7 +2114,7 @@
                         <a:cxnLst/>
                         <a:rect l="l" t="t" r="r" b="b"/>
                         <a:pathLst>
-                          <a:path w="2185035" h="0">
+                          <a:path w="2185035">
                             <a:moveTo>
                               <a:pt x="0" y="0"/>
                             </a:moveTo>
@@ -2712,7 +2143,7 @@
             </wp:anchor>
           </w:drawing>
         </mc:Choice>
-        <mc:Fallback>
+        <mc:Fallback xmlns:pic="http://schemas.openxmlformats.org/drawingml/2006/picture" xmlns:a="http://schemas.openxmlformats.org/drawingml/2006/main" xmlns:ve="http://schemas.openxmlformats.org/markup-compatibility/2006">
           <w:pict>
             <v:line style="position:absolute;mso-position-horizontal-relative:page;mso-position-vertical-relative:page;z-index:-15765504" from="315.239990pt,729.537842pt" to="487.275887pt,729.537842pt" stroked="true" strokeweight=".512153pt" strokecolor="#000000">
               <v:stroke dashstyle="solid"/>
@@ -2726,8 +2157,27 @@
 </w:ftr>
 </file>
 
+<file path=word/footnotes.xml><?xml version="1.0" encoding="utf-8"?>
+<w:footnotes xmlns:wpc="http://schemas.microsoft.com/office/word/2010/wordprocessingCanvas" xmlns:cx="http://schemas.microsoft.com/office/drawing/2014/chartex" xmlns:cx1="http://schemas.microsoft.com/office/drawing/2015/9/8/chartex" xmlns:cx2="http://schemas.microsoft.com/office/drawing/2015/10/21/chartex" xmlns:cx3="http://schemas.microsoft.com/office/drawing/2016/5/9/chartex" xmlns:cx4="http://schemas.microsoft.com/office/drawing/2016/5/10/chartex" xmlns:cx5="http://schemas.microsoft.com/office/drawing/2016/5/11/chartex" xmlns:cx6="http://schemas.microsoft.com/office/drawing/2016/5/12/chartex" xmlns:cx7="http://schemas.microsoft.com/office/drawing/2016/5/13/chartex" xmlns:cx8="http://schemas.microsoft.com/office/drawing/2016/5/14/chartex" xmlns:mc="http://schemas.openxmlformats.org/markup-compatibility/2006" xmlns:m="http://schemas.openxmlformats.org/officeDocument/2006/math" xmlns:aink="http://schemas.microsoft.com/office/drawing/2016/ink" xmlns:am3d="http://schemas.microsoft.com/office/drawing/2017/model3d" xmlns:oel="http://schemas.microsoft.com/office/2019/extlst" xmlns:r="http://schemas.openxmlformats.org/officeDocument/2006/relationships" xmlns:wp14="http://schemas.microsoft.com/office/word/2010/wordprocessingDrawing" xmlns:wp="http://schemas.openxmlformats.org/drawingml/2006/wordprocessingDrawing" xmlns:wpg="http://schemas.microsoft.com/office/word/2010/wordprocessingGroup" xmlns:wpi="http://schemas.microsoft.com/office/word/2010/wordprocessingInk" xmlns:wps="http://schemas.microsoft.com/office/word/2010/wordprocessingShape" xmlns:o="urn:schemas-microsoft-com:office:office" xmlns:v="urn:schemas-microsoft-com:vml" xmlns:w10="urn:schemas-microsoft-com:office:word" xmlns:w="http://schemas.openxmlformats.org/wordprocessingml/2006/main" xmlns:w14="http://schemas.microsoft.com/office/word/2010/wordml" xmlns:w15="http://schemas.microsoft.com/office/word/2012/wordml" xmlns:w16cex="http://schemas.microsoft.com/office/word/2018/wordml/cex" xmlns:w16cid="http://schemas.microsoft.com/office/word/2016/wordml/cid" xmlns:w16="http://schemas.microsoft.com/office/word/2018/wordml" xmlns:w16sdtdh="http://schemas.microsoft.com/office/word/2020/wordml/sdtdatahash" xmlns:w16sdtfl="http://schemas.microsoft.com/office/word/2024/wordml/sdtformatlock" xmlns:w16se="http://schemas.microsoft.com/office/word/2015/wordml/symex" xmlns:w16du="http://schemas.microsoft.com/office/word/2023/wordml/word16du" xmlns:wne="http://schemas.microsoft.com/office/word/2006/wordml" mc:Ignorable="w14 w15 w16se w16cid w16 w16cex w16sdtdh w16sdtfl w16du wp14">
+  <w:footnote w:type="separator" w:id="-1">
+    <w:p>
+      <w:r>
+        <w:separator/>
+      </w:r>
+    </w:p>
+  </w:footnote>
+  <w:footnote w:type="continuationSeparator" w:id="0">
+    <w:p>
+      <w:r>
+        <w:continuationSeparator/>
+      </w:r>
+    </w:p>
+  </w:footnote>
+</w:footnotes>
+</file>
+
 <file path=word/header1.xml><?xml version="1.0" encoding="utf-8"?>
-<w:hdr xmlns:mc="http://schemas.openxmlformats.org/markup-compatibility/2006" xmlns:ve="http://schemas.openxmlformats.org/markup-compatibility/2006" xmlns:o="urn:schemas-microsoft-com:office:office" xmlns:r="http://schemas.openxmlformats.org/officeDocument/2006/relationships" xmlns:m="http://schemas.openxmlformats.org/officeDocument/2006/math" xmlns:v="urn:schemas-microsoft-com:vml" xmlns:wp="http://schemas.openxmlformats.org/drawingml/2006/wordprocessingDrawing" xmlns:w10="urn:schemas-microsoft-com:office:word" xmlns:w="http://schemas.openxmlformats.org/wordprocessingml/2006/main" xmlns:wne="http://schemas.microsoft.com/office/word/2006/wordml" xmlns:a="http://schemas.openxmlformats.org/drawingml/2006/main" xmlns:pic="http://schemas.openxmlformats.org/drawingml/2006/picture" xmlns:wpg="http://schemas.microsoft.com/office/word/2010/wordprocessingGroup" xmlns:wps="http://schemas.microsoft.com/office/word/2010/wordprocessingShape" xmlns:w14="http://schemas.microsoft.com/office/word/2010/wordml" mc:Ignorable="w14" xml:space="preserve">
+<w:hdr xmlns:wpc="http://schemas.microsoft.com/office/word/2010/wordprocessingCanvas" xmlns:cx="http://schemas.microsoft.com/office/drawing/2014/chartex" xmlns:cx1="http://schemas.microsoft.com/office/drawing/2015/9/8/chartex" xmlns:cx2="http://schemas.microsoft.com/office/drawing/2015/10/21/chartex" xmlns:cx3="http://schemas.microsoft.com/office/drawing/2016/5/9/chartex" xmlns:cx4="http://schemas.microsoft.com/office/drawing/2016/5/10/chartex" xmlns:cx5="http://schemas.microsoft.com/office/drawing/2016/5/11/chartex" xmlns:cx6="http://schemas.microsoft.com/office/drawing/2016/5/12/chartex" xmlns:cx7="http://schemas.microsoft.com/office/drawing/2016/5/13/chartex" xmlns:cx8="http://schemas.microsoft.com/office/drawing/2016/5/14/chartex" xmlns:mc="http://schemas.openxmlformats.org/markup-compatibility/2006" xmlns:m="http://schemas.openxmlformats.org/officeDocument/2006/math" xmlns:aink="http://schemas.microsoft.com/office/drawing/2016/ink" xmlns:am3d="http://schemas.microsoft.com/office/drawing/2017/model3d" xmlns:oel="http://schemas.microsoft.com/office/2019/extlst" xmlns:r="http://schemas.openxmlformats.org/officeDocument/2006/relationships" xmlns:wp14="http://schemas.microsoft.com/office/word/2010/wordprocessingDrawing" xmlns:wp="http://schemas.openxmlformats.org/drawingml/2006/wordprocessingDrawing" xmlns:wpg="http://schemas.microsoft.com/office/word/2010/wordprocessingGroup" xmlns:wpi="http://schemas.microsoft.com/office/word/2010/wordprocessingInk" xmlns:wps="http://schemas.microsoft.com/office/word/2010/wordprocessingShape" xmlns:o="urn:schemas-microsoft-com:office:office" xmlns:v="urn:schemas-microsoft-com:vml" xmlns:w10="urn:schemas-microsoft-com:office:word" xmlns:w="http://schemas.openxmlformats.org/wordprocessingml/2006/main" xmlns:w14="http://schemas.microsoft.com/office/word/2010/wordml" xmlns:w15="http://schemas.microsoft.com/office/word/2012/wordml" xmlns:w16cex="http://schemas.microsoft.com/office/word/2018/wordml/cex" xmlns:w16cid="http://schemas.microsoft.com/office/word/2016/wordml/cid" xmlns:w16="http://schemas.microsoft.com/office/word/2018/wordml" xmlns:w16sdtdh="http://schemas.microsoft.com/office/word/2020/wordml/sdtdatahash" xmlns:w16sdtfl="http://schemas.microsoft.com/office/word/2024/wordml/sdtformatlock" xmlns:w16se="http://schemas.microsoft.com/office/word/2015/wordml/symex" xmlns:w16du="http://schemas.microsoft.com/office/word/2023/wordml/word16du" xmlns:wne="http://schemas.microsoft.com/office/word/2006/wordml" mc:Ignorable="w14 w15 w16se w16cid w16 w16cex w16sdtdh w16sdtfl w16du wp14">
   <w:p>
     <w:pPr>
       <w:pStyle w:val="BodyText"/>
@@ -2738,12 +2188,13 @@
     </w:pPr>
     <w:r>
       <w:rPr>
+        <w:noProof/>
         <w:sz w:val="20"/>
       </w:rPr>
       <mc:AlternateContent>
         <mc:Choice Requires="wps">
           <w:drawing>
-            <wp:anchor distT="0" distB="0" distL="0" distR="0" allowOverlap="1" layoutInCell="1" locked="0" behindDoc="1" simplePos="0" relativeHeight="487549440">
+            <wp:anchor distT="0" distB="0" distL="0" distR="0" simplePos="0" relativeHeight="487549440" behindDoc="1" locked="0" layoutInCell="1" allowOverlap="1" wp14:anchorId="7E238D71" wp14:editId="34F6117A">
               <wp:simplePos x="0" y="0"/>
               <wp:positionH relativeFrom="page">
                 <wp:posOffset>2962148</wp:posOffset>
@@ -2756,13 +2207,14 @@
               <wp:wrapNone/>
               <wp:docPr id="1" name="Textbox 1"/>
               <wp:cNvGraphicFramePr>
-                <a:graphicFrameLocks/>
+                <a:graphicFrameLocks xmlns:a="http://schemas.openxmlformats.org/drawingml/2006/main"/>
               </wp:cNvGraphicFramePr>
-              <a:graphic>
+              <a:graphic xmlns:a="http://schemas.openxmlformats.org/drawingml/2006/main">
                 <a:graphicData uri="http://schemas.microsoft.com/office/word/2010/wordprocessingShape">
                   <wps:wsp>
-                    <wps:cNvPr id="1" name="Textbox 1"/>
-                    <wps:cNvSpPr txBox="1"/>
+                    <wps:cNvSpPr txBox="1">
+                      <a:spLocks/>
+                    </wps:cNvSpPr>
                     <wps:spPr>
                       <a:xfrm>
                         <a:off x="0" y="0"/>
@@ -2777,18 +2229,15 @@
                         <w:p>
                           <w:pPr>
                             <w:spacing w:before="21"/>
-                            <w:ind w:left="20" w:right="0" w:firstLine="0"/>
-                            <w:jc w:val="left"/>
+                            <w:ind w:left="20"/>
                             <w:rPr>
                               <w:b/>
-                              <w:sz w:val="22"/>
                             </w:rPr>
                           </w:pPr>
                           <w:r>
                             <w:rPr>
                               <w:b/>
                               <w:w w:val="90"/>
-                              <w:sz w:val="22"/>
                             </w:rPr>
                             <w:t>(COMPANY</w:t>
                           </w:r>
@@ -2796,16 +2245,14 @@
                             <w:rPr>
                               <w:b/>
                               <w:spacing w:val="21"/>
-                              <w:sz w:val="22"/>
-                            </w:rPr>
-                            <w:t> </w:t>
+                            </w:rPr>
+                            <w:t xml:space="preserve"> </w:t>
                           </w:r>
                           <w:r>
                             <w:rPr>
                               <w:b/>
                               <w:spacing w:val="-2"/>
                               <w:w w:val="90"/>
-                              <w:sz w:val="22"/>
                             </w:rPr>
                             <w:t>LETTERHEAD)</w:t>
                           </w:r>
@@ -2821,7 +2268,7 @@
             </wp:anchor>
           </w:drawing>
         </mc:Choice>
-        <mc:Fallback>
+        <mc:Fallback xmlns:pic="http://schemas.openxmlformats.org/drawingml/2006/picture" xmlns:a="http://schemas.openxmlformats.org/drawingml/2006/main" xmlns:ve="http://schemas.openxmlformats.org/markup-compatibility/2006">
           <w:pict>
             <v:shapetype id="_x0000_t202" o:spt="202" coordsize="21600,21600" path="m,l,21600r21600,l21600,xe">
               <v:stroke joinstyle="miter"/>
@@ -2876,12 +2323,13 @@
     </w:r>
     <w:r>
       <w:rPr>
+        <w:noProof/>
         <w:sz w:val="20"/>
       </w:rPr>
       <mc:AlternateContent>
         <mc:Choice Requires="wps">
           <w:drawing>
-            <wp:anchor distT="0" distB="0" distL="0" distR="0" allowOverlap="1" layoutInCell="1" locked="0" behindDoc="1" simplePos="0" relativeHeight="487549952">
+            <wp:anchor distT="0" distB="0" distL="0" distR="0" simplePos="0" relativeHeight="487549952" behindDoc="1" locked="0" layoutInCell="1" allowOverlap="1" wp14:anchorId="5F093EAC" wp14:editId="00B64606">
               <wp:simplePos x="0" y="0"/>
               <wp:positionH relativeFrom="page">
                 <wp:posOffset>2777774</wp:posOffset>
@@ -2894,13 +2342,14 @@
               <wp:wrapNone/>
               <wp:docPr id="2" name="Textbox 2"/>
               <wp:cNvGraphicFramePr>
-                <a:graphicFrameLocks/>
+                <a:graphicFrameLocks xmlns:a="http://schemas.openxmlformats.org/drawingml/2006/main"/>
               </wp:cNvGraphicFramePr>
-              <a:graphic>
+              <a:graphic xmlns:a="http://schemas.openxmlformats.org/drawingml/2006/main">
                 <a:graphicData uri="http://schemas.microsoft.com/office/word/2010/wordprocessingShape">
                   <wps:wsp>
-                    <wps:cNvPr id="2" name="Textbox 2"/>
-                    <wps:cNvSpPr txBox="1"/>
+                    <wps:cNvSpPr txBox="1">
+                      <a:spLocks/>
+                    </wps:cNvSpPr>
                     <wps:spPr>
                       <a:xfrm>
                         <a:off x="0" y="0"/>
@@ -2915,18 +2364,15 @@
                         <w:p>
                           <w:pPr>
                             <w:spacing w:before="21"/>
-                            <w:ind w:left="20" w:right="0" w:firstLine="0"/>
-                            <w:jc w:val="left"/>
+                            <w:ind w:left="20"/>
                             <w:rPr>
                               <w:b/>
-                              <w:sz w:val="22"/>
                             </w:rPr>
                           </w:pPr>
                           <w:r>
                             <w:rPr>
                               <w:b/>
                               <w:w w:val="90"/>
-                              <w:sz w:val="22"/>
                             </w:rPr>
                             <w:t>SPECIAL</w:t>
                           </w:r>
@@ -2935,15 +2381,13 @@
                               <w:b/>
                               <w:spacing w:val="-6"/>
                               <w:w w:val="90"/>
-                              <w:sz w:val="22"/>
-                            </w:rPr>
-                            <w:t> </w:t>
+                            </w:rPr>
+                            <w:t xml:space="preserve"> </w:t>
                           </w:r>
                           <w:r>
                             <w:rPr>
                               <w:b/>
                               <w:w w:val="90"/>
-                              <w:sz w:val="22"/>
                             </w:rPr>
                             <w:t>POWER</w:t>
                           </w:r>
@@ -2952,15 +2396,13 @@
                               <w:b/>
                               <w:spacing w:val="-5"/>
                               <w:w w:val="90"/>
-                              <w:sz w:val="22"/>
-                            </w:rPr>
-                            <w:t> </w:t>
+                            </w:rPr>
+                            <w:t xml:space="preserve"> </w:t>
                           </w:r>
                           <w:r>
                             <w:rPr>
                               <w:b/>
                               <w:w w:val="90"/>
-                              <w:sz w:val="22"/>
                             </w:rPr>
                             <w:t>OF</w:t>
                           </w:r>
@@ -2969,16 +2411,14 @@
                               <w:b/>
                               <w:spacing w:val="-3"/>
                               <w:w w:val="90"/>
-                              <w:sz w:val="22"/>
-                            </w:rPr>
-                            <w:t> </w:t>
+                            </w:rPr>
+                            <w:t xml:space="preserve"> </w:t>
                           </w:r>
                           <w:r>
                             <w:rPr>
                               <w:b/>
                               <w:spacing w:val="-2"/>
                               <w:w w:val="90"/>
-                              <w:sz w:val="22"/>
                             </w:rPr>
                             <w:t>ATTORNEY</w:t>
                           </w:r>
@@ -2994,7 +2434,7 @@
             </wp:anchor>
           </w:drawing>
         </mc:Choice>
-        <mc:Fallback>
+        <mc:Fallback xmlns:pic="http://schemas.openxmlformats.org/drawingml/2006/picture" xmlns:a="http://schemas.openxmlformats.org/drawingml/2006/main" xmlns:ve="http://schemas.openxmlformats.org/markup-compatibility/2006">
           <w:pict>
             <v:shape style="position:absolute;margin-left:218.722397pt;margin-top:52.825172pt;width:157.950pt;height:15.5pt;mso-position-horizontal-relative:page;mso-position-vertical-relative:page;z-index:-15766528" type="#_x0000_t202" id="docshape2" filled="false" stroked="false">
               <v:textbox inset="0,0,0,0">
@@ -3083,10 +2523,12 @@
 </file>
 
 <file path=word/numbering.xml><?xml version="1.0" encoding="utf-8"?>
-<w:numbering xmlns:ve="http://schemas.openxmlformats.org/markup-compatibility/2006" xmlns:o="urn:schemas-microsoft-com:office:office" xmlns:r="http://schemas.openxmlformats.org/officeDocument/2006/relationships" xmlns:m="http://schemas.openxmlformats.org/officeDocument/2006/math" xmlns:v="urn:schemas-microsoft-com:vml" xmlns:wp="http://schemas.openxmlformats.org/drawingml/2006/wordprocessingDrawing" xmlns:w10="urn:schemas-microsoft-com:office:word" xmlns:w="http://schemas.openxmlformats.org/wordprocessingml/2006/main" xmlns:wne="http://schemas.microsoft.com/office/word/2006/wordml">
-  <w:abstractNum w:abstractNumId="0">
+<w:numbering xmlns:wpc="http://schemas.microsoft.com/office/word/2010/wordprocessingCanvas" xmlns:cx="http://schemas.microsoft.com/office/drawing/2014/chartex" xmlns:cx1="http://schemas.microsoft.com/office/drawing/2015/9/8/chartex" xmlns:cx2="http://schemas.microsoft.com/office/drawing/2015/10/21/chartex" xmlns:cx3="http://schemas.microsoft.com/office/drawing/2016/5/9/chartex" xmlns:cx4="http://schemas.microsoft.com/office/drawing/2016/5/10/chartex" xmlns:cx5="http://schemas.microsoft.com/office/drawing/2016/5/11/chartex" xmlns:cx6="http://schemas.microsoft.com/office/drawing/2016/5/12/chartex" xmlns:cx7="http://schemas.microsoft.com/office/drawing/2016/5/13/chartex" xmlns:cx8="http://schemas.microsoft.com/office/drawing/2016/5/14/chartex" xmlns:mc="http://schemas.openxmlformats.org/markup-compatibility/2006" xmlns:m="http://schemas.openxmlformats.org/officeDocument/2006/math" xmlns:aink="http://schemas.microsoft.com/office/drawing/2016/ink" xmlns:am3d="http://schemas.microsoft.com/office/drawing/2017/model3d" xmlns:oel="http://schemas.microsoft.com/office/2019/extlst" xmlns:r="http://schemas.openxmlformats.org/officeDocument/2006/relationships" xmlns:wp14="http://schemas.microsoft.com/office/word/2010/wordprocessingDrawing" xmlns:wp="http://schemas.openxmlformats.org/drawingml/2006/wordprocessingDrawing" xmlns:wpg="http://schemas.microsoft.com/office/word/2010/wordprocessingGroup" xmlns:wpi="http://schemas.microsoft.com/office/word/2010/wordprocessingInk" xmlns:wps="http://schemas.microsoft.com/office/word/2010/wordprocessingShape" xmlns:o="urn:schemas-microsoft-com:office:office" xmlns:v="urn:schemas-microsoft-com:vml" xmlns:w10="urn:schemas-microsoft-com:office:word" xmlns:w="http://schemas.openxmlformats.org/wordprocessingml/2006/main" xmlns:w14="http://schemas.microsoft.com/office/word/2010/wordml" xmlns:w15="http://schemas.microsoft.com/office/word/2012/wordml" xmlns:w16cex="http://schemas.microsoft.com/office/word/2018/wordml/cex" xmlns:w16cid="http://schemas.microsoft.com/office/word/2016/wordml/cid" xmlns:w16="http://schemas.microsoft.com/office/word/2018/wordml" xmlns:w16sdtdh="http://schemas.microsoft.com/office/word/2020/wordml/sdtdatahash" xmlns:w16sdtfl="http://schemas.microsoft.com/office/word/2024/wordml/sdtformatlock" xmlns:w16se="http://schemas.microsoft.com/office/word/2015/wordml/symex" xmlns:w16du="http://schemas.microsoft.com/office/word/2023/wordml/word16du" xmlns:wne="http://schemas.microsoft.com/office/word/2006/wordml" mc:Ignorable="w14 w15 w16se w16cid w16 w16cex w16sdtdh w16sdtfl w16du wp14">
+  <w:abstractNum w:abstractNumId="0" w15:restartNumberingAfterBreak="0">
+    <w:nsid w:val="7F7450F9"/>
     <w:multiLevelType w:val="hybridMultilevel"/>
-    <w:lvl w:ilvl="0">
+    <w:tmpl w:val="3934E772"/>
+    <w:lvl w:ilvl="0" w:tplc="8C482998">
       <w:start w:val="1"/>
       <w:numFmt w:val="decimal"/>
       <w:lvlText w:val="%1."/>
@@ -3096,7 +2538,7 @@
         <w:jc w:val="left"/>
       </w:pPr>
       <w:rPr>
-        <w:rFonts w:hint="default" w:ascii="Arial" w:hAnsi="Arial" w:eastAsia="Arial" w:cs="Arial"/>
+        <w:rFonts w:ascii="Arial" w:eastAsia="Arial" w:hAnsi="Arial" w:cs="Arial" w:hint="default"/>
         <w:b w:val="0"/>
         <w:bCs w:val="0"/>
         <w:i w:val="0"/>
@@ -3108,8 +2550,7 @@
         <w:lang w:val="en-US" w:eastAsia="en-US" w:bidi="ar-SA"/>
       </w:rPr>
     </w:lvl>
-    <w:lvl w:ilvl="1">
-      <w:start w:val="0"/>
+    <w:lvl w:ilvl="1" w:tplc="271E27EC">
       <w:numFmt w:val="bullet"/>
       <w:lvlText w:val="•"/>
       <w:lvlJc w:val="left"/>
@@ -3121,8 +2562,7 @@
         <w:lang w:val="en-US" w:eastAsia="en-US" w:bidi="ar-SA"/>
       </w:rPr>
     </w:lvl>
-    <w:lvl w:ilvl="2">
-      <w:start w:val="0"/>
+    <w:lvl w:ilvl="2" w:tplc="0BF2A838">
       <w:numFmt w:val="bullet"/>
       <w:lvlText w:val="•"/>
       <w:lvlJc w:val="left"/>
@@ -3134,8 +2574,7 @@
         <w:lang w:val="en-US" w:eastAsia="en-US" w:bidi="ar-SA"/>
       </w:rPr>
     </w:lvl>
-    <w:lvl w:ilvl="3">
-      <w:start w:val="0"/>
+    <w:lvl w:ilvl="3" w:tplc="E3D05970">
       <w:numFmt w:val="bullet"/>
       <w:lvlText w:val="•"/>
       <w:lvlJc w:val="left"/>
@@ -3147,8 +2586,7 @@
         <w:lang w:val="en-US" w:eastAsia="en-US" w:bidi="ar-SA"/>
       </w:rPr>
     </w:lvl>
-    <w:lvl w:ilvl="4">
-      <w:start w:val="0"/>
+    <w:lvl w:ilvl="4" w:tplc="9BC2F0D2">
       <w:numFmt w:val="bullet"/>
       <w:lvlText w:val="•"/>
       <w:lvlJc w:val="left"/>
@@ -3160,8 +2598,7 @@
         <w:lang w:val="en-US" w:eastAsia="en-US" w:bidi="ar-SA"/>
       </w:rPr>
     </w:lvl>
-    <w:lvl w:ilvl="5">
-      <w:start w:val="0"/>
+    <w:lvl w:ilvl="5" w:tplc="2A1016C4">
       <w:numFmt w:val="bullet"/>
       <w:lvlText w:val="•"/>
       <w:lvlJc w:val="left"/>
@@ -3173,8 +2610,7 @@
         <w:lang w:val="en-US" w:eastAsia="en-US" w:bidi="ar-SA"/>
       </w:rPr>
     </w:lvl>
-    <w:lvl w:ilvl="6">
-      <w:start w:val="0"/>
+    <w:lvl w:ilvl="6" w:tplc="ADA8AB86">
       <w:numFmt w:val="bullet"/>
       <w:lvlText w:val="•"/>
       <w:lvlJc w:val="left"/>
@@ -3186,8 +2622,7 @@
         <w:lang w:val="en-US" w:eastAsia="en-US" w:bidi="ar-SA"/>
       </w:rPr>
     </w:lvl>
-    <w:lvl w:ilvl="7">
-      <w:start w:val="0"/>
+    <w:lvl w:ilvl="7" w:tplc="D90060FE">
       <w:numFmt w:val="bullet"/>
       <w:lvlText w:val="•"/>
       <w:lvlJc w:val="left"/>
@@ -3199,8 +2634,7 @@
         <w:lang w:val="en-US" w:eastAsia="en-US" w:bidi="ar-SA"/>
       </w:rPr>
     </w:lvl>
-    <w:lvl w:ilvl="8">
-      <w:start w:val="0"/>
+    <w:lvl w:ilvl="8" w:tplc="890E519E">
       <w:numFmt w:val="bullet"/>
       <w:lvlText w:val="•"/>
       <w:lvlJc w:val="left"/>
@@ -3213,21 +2647,21 @@
       </w:rPr>
     </w:lvl>
   </w:abstractNum>
-  <w:num w:numId="1">
+  <w:num w:numId="1" w16cid:durableId="399712077">
     <w:abstractNumId w:val="0"/>
   </w:num>
 </w:numbering>
 </file>
 
 <file path=word/styles.xml><?xml version="1.0" encoding="utf-8"?>
-<w:styles xmlns:r="http://schemas.openxmlformats.org/officeDocument/2006/relationships" xmlns:w="http://schemas.openxmlformats.org/wordprocessingml/2006/main">
+<w:styles xmlns:mc="http://schemas.openxmlformats.org/markup-compatibility/2006" xmlns:r="http://schemas.openxmlformats.org/officeDocument/2006/relationships" xmlns:w="http://schemas.openxmlformats.org/wordprocessingml/2006/main" xmlns:w14="http://schemas.microsoft.com/office/word/2010/wordml" xmlns:w15="http://schemas.microsoft.com/office/word/2012/wordml" xmlns:w16cex="http://schemas.microsoft.com/office/word/2018/wordml/cex" xmlns:w16cid="http://schemas.microsoft.com/office/word/2016/wordml/cid" xmlns:w16="http://schemas.microsoft.com/office/word/2018/wordml" xmlns:w16sdtdh="http://schemas.microsoft.com/office/word/2020/wordml/sdtdatahash" xmlns:w16sdtfl="http://schemas.microsoft.com/office/word/2024/wordml/sdtformatlock" xmlns:w16se="http://schemas.microsoft.com/office/word/2015/wordml/symex" xmlns:w16du="http://schemas.microsoft.com/office/word/2023/wordml/word16du" mc:Ignorable="w14 w15 w16se w16cid w16 w16cex w16sdtdh w16sdtfl w16du">
   <w:docDefaults>
     <w:rPrDefault>
       <w:rPr>
-        <w:rFonts w:cstheme="minorBidi" w:hAnsiTheme="minorHAnsi" w:eastAsiaTheme="minorHAnsi" w:asciiTheme="minorHAnsi"/>
+        <w:rFonts w:asciiTheme="minorHAnsi" w:eastAsiaTheme="minorHAnsi" w:hAnsiTheme="minorHAnsi" w:cstheme="minorBidi"/>
         <w:sz w:val="22"/>
         <w:szCs w:val="22"/>
-        <w:lang w:val="en-US" w:bidi="ar-SA" w:eastAsia="en-US"/>
+        <w:lang w:val="en-US" w:eastAsia="en-US" w:bidi="ar-SA"/>
       </w:rPr>
     </w:rPrDefault>
     <w:pPrDefault>
@@ -3235,83 +2669,443 @@
         <w:widowControl w:val="0"/>
         <w:autoSpaceDE w:val="0"/>
         <w:autoSpaceDN w:val="0"/>
-        <w:spacing w:lineRule="auto" w:line="240" w:before="0" w:after="0"/>
-        <w:ind w:left="0" w:right="0"/>
-        <w:jc w:val="left"/>
       </w:pPr>
     </w:pPrDefault>
   </w:docDefaults>
-  <w:style w:styleId="DefaultParagraphFont" w:default="1" w:type="character">
+  <w:latentStyles w:defLockedState="0" w:defUIPriority="99" w:defSemiHidden="0" w:defUnhideWhenUsed="0" w:defQFormat="0" w:count="376">
+    <w:lsdException w:name="Normal" w:uiPriority="0" w:qFormat="1"/>
+    <w:lsdException w:name="heading 1" w:uiPriority="9" w:qFormat="1"/>
+    <w:lsdException w:name="heading 2" w:semiHidden="1" w:uiPriority="9" w:unhideWhenUsed="1" w:qFormat="1"/>
+    <w:lsdException w:name="heading 3" w:semiHidden="1" w:uiPriority="9" w:unhideWhenUsed="1" w:qFormat="1"/>
+    <w:lsdException w:name="heading 4" w:semiHidden="1" w:uiPriority="9" w:unhideWhenUsed="1" w:qFormat="1"/>
+    <w:lsdException w:name="heading 5" w:semiHidden="1" w:uiPriority="9" w:unhideWhenUsed="1" w:qFormat="1"/>
+    <w:lsdException w:name="heading 6" w:semiHidden="1" w:uiPriority="9" w:unhideWhenUsed="1" w:qFormat="1"/>
+    <w:lsdException w:name="heading 7" w:semiHidden="1" w:uiPriority="9" w:unhideWhenUsed="1" w:qFormat="1"/>
+    <w:lsdException w:name="heading 8" w:semiHidden="1" w:uiPriority="9" w:unhideWhenUsed="1" w:qFormat="1"/>
+    <w:lsdException w:name="heading 9" w:semiHidden="1" w:uiPriority="9" w:unhideWhenUsed="1" w:qFormat="1"/>
+    <w:lsdException w:name="index 1" w:semiHidden="1" w:unhideWhenUsed="1"/>
+    <w:lsdException w:name="index 2" w:semiHidden="1" w:unhideWhenUsed="1"/>
+    <w:lsdException w:name="index 3" w:semiHidden="1" w:unhideWhenUsed="1"/>
+    <w:lsdException w:name="index 4" w:semiHidden="1" w:unhideWhenUsed="1"/>
+    <w:lsdException w:name="index 5" w:semiHidden="1" w:unhideWhenUsed="1"/>
+    <w:lsdException w:name="index 6" w:semiHidden="1" w:unhideWhenUsed="1"/>
+    <w:lsdException w:name="index 7" w:semiHidden="1" w:unhideWhenUsed="1"/>
+    <w:lsdException w:name="index 8" w:semiHidden="1" w:unhideWhenUsed="1"/>
+    <w:lsdException w:name="index 9" w:semiHidden="1" w:unhideWhenUsed="1"/>
+    <w:lsdException w:name="toc 1" w:semiHidden="1" w:uiPriority="39" w:unhideWhenUsed="1"/>
+    <w:lsdException w:name="toc 2" w:semiHidden="1" w:uiPriority="39" w:unhideWhenUsed="1"/>
+    <w:lsdException w:name="toc 3" w:semiHidden="1" w:uiPriority="39" w:unhideWhenUsed="1"/>
+    <w:lsdException w:name="toc 4" w:semiHidden="1" w:uiPriority="39" w:unhideWhenUsed="1"/>
+    <w:lsdException w:name="toc 5" w:semiHidden="1" w:uiPriority="39" w:unhideWhenUsed="1"/>
+    <w:lsdException w:name="toc 6" w:semiHidden="1" w:uiPriority="39" w:unhideWhenUsed="1"/>
+    <w:lsdException w:name="toc 7" w:semiHidden="1" w:uiPriority="39" w:unhideWhenUsed="1"/>
+    <w:lsdException w:name="toc 8" w:semiHidden="1" w:uiPriority="39" w:unhideWhenUsed="1"/>
+    <w:lsdException w:name="toc 9" w:semiHidden="1" w:uiPriority="39" w:unhideWhenUsed="1"/>
+    <w:lsdException w:name="Normal Indent" w:semiHidden="1" w:unhideWhenUsed="1"/>
+    <w:lsdException w:name="footnote text" w:semiHidden="1" w:unhideWhenUsed="1"/>
+    <w:lsdException w:name="annotation text" w:semiHidden="1" w:unhideWhenUsed="1"/>
+    <w:lsdException w:name="header" w:semiHidden="1" w:unhideWhenUsed="1"/>
+    <w:lsdException w:name="footer" w:semiHidden="1" w:unhideWhenUsed="1"/>
+    <w:lsdException w:name="index heading" w:semiHidden="1" w:unhideWhenUsed="1"/>
+    <w:lsdException w:name="caption" w:semiHidden="1" w:uiPriority="35" w:unhideWhenUsed="1" w:qFormat="1"/>
+    <w:lsdException w:name="table of figures" w:semiHidden="1" w:unhideWhenUsed="1"/>
+    <w:lsdException w:name="envelope address" w:semiHidden="1" w:unhideWhenUsed="1"/>
+    <w:lsdException w:name="envelope return" w:semiHidden="1" w:unhideWhenUsed="1"/>
+    <w:lsdException w:name="footnote reference" w:semiHidden="1" w:unhideWhenUsed="1"/>
+    <w:lsdException w:name="annotation reference" w:semiHidden="1" w:unhideWhenUsed="1"/>
+    <w:lsdException w:name="line number" w:semiHidden="1" w:unhideWhenUsed="1"/>
+    <w:lsdException w:name="page number" w:semiHidden="1" w:unhideWhenUsed="1"/>
+    <w:lsdException w:name="endnote reference" w:semiHidden="1" w:unhideWhenUsed="1"/>
+    <w:lsdException w:name="endnote text" w:semiHidden="1" w:unhideWhenUsed="1"/>
+    <w:lsdException w:name="table of authorities" w:semiHidden="1" w:unhideWhenUsed="1"/>
+    <w:lsdException w:name="macro" w:semiHidden="1" w:unhideWhenUsed="1"/>
+    <w:lsdException w:name="toa heading" w:semiHidden="1" w:unhideWhenUsed="1"/>
+    <w:lsdException w:name="List" w:semiHidden="1" w:unhideWhenUsed="1"/>
+    <w:lsdException w:name="List Bullet" w:semiHidden="1" w:unhideWhenUsed="1"/>
+    <w:lsdException w:name="List Number" w:semiHidden="1" w:unhideWhenUsed="1"/>
+    <w:lsdException w:name="List 2" w:semiHidden="1" w:unhideWhenUsed="1"/>
+    <w:lsdException w:name="List 3" w:semiHidden="1" w:unhideWhenUsed="1"/>
+    <w:lsdException w:name="List 4" w:semiHidden="1" w:unhideWhenUsed="1"/>
+    <w:lsdException w:name="List 5" w:semiHidden="1" w:unhideWhenUsed="1"/>
+    <w:lsdException w:name="List Bullet 2" w:semiHidden="1" w:unhideWhenUsed="1"/>
+    <w:lsdException w:name="List Bullet 3" w:semiHidden="1" w:unhideWhenUsed="1"/>
+    <w:lsdException w:name="List Bullet 4" w:semiHidden="1" w:unhideWhenUsed="1"/>
+    <w:lsdException w:name="List Bullet 5" w:semiHidden="1" w:unhideWhenUsed="1"/>
+    <w:lsdException w:name="List Number 2" w:semiHidden="1" w:unhideWhenUsed="1"/>
+    <w:lsdException w:name="List Number 3" w:semiHidden="1" w:unhideWhenUsed="1"/>
+    <w:lsdException w:name="List Number 4" w:semiHidden="1" w:unhideWhenUsed="1"/>
+    <w:lsdException w:name="List Number 5" w:semiHidden="1" w:unhideWhenUsed="1"/>
+    <w:lsdException w:name="Title" w:uiPriority="10" w:qFormat="1"/>
+    <w:lsdException w:name="Closing" w:semiHidden="1" w:unhideWhenUsed="1"/>
+    <w:lsdException w:name="Signature" w:semiHidden="1" w:unhideWhenUsed="1"/>
+    <w:lsdException w:name="Default Paragraph Font" w:semiHidden="1" w:uiPriority="1" w:unhideWhenUsed="1"/>
+    <w:lsdException w:name="Body Text" w:semiHidden="1" w:unhideWhenUsed="1"/>
+    <w:lsdException w:name="Body Text Indent" w:semiHidden="1" w:unhideWhenUsed="1"/>
+    <w:lsdException w:name="List Continue" w:semiHidden="1" w:unhideWhenUsed="1"/>
+    <w:lsdException w:name="List Continue 2" w:semiHidden="1" w:unhideWhenUsed="1"/>
+    <w:lsdException w:name="List Continue 3" w:semiHidden="1" w:unhideWhenUsed="1"/>
+    <w:lsdException w:name="List Continue 4" w:semiHidden="1" w:unhideWhenUsed="1"/>
+    <w:lsdException w:name="List Continue 5" w:semiHidden="1" w:unhideWhenUsed="1"/>
+    <w:lsdException w:name="Message Header" w:semiHidden="1" w:unhideWhenUsed="1"/>
+    <w:lsdException w:name="Subtitle" w:uiPriority="11" w:qFormat="1"/>
+    <w:lsdException w:name="Salutation" w:semiHidden="1" w:unhideWhenUsed="1"/>
+    <w:lsdException w:name="Date" w:semiHidden="1" w:unhideWhenUsed="1"/>
+    <w:lsdException w:name="Body Text First Indent" w:semiHidden="1" w:unhideWhenUsed="1"/>
+    <w:lsdException w:name="Body Text First Indent 2" w:semiHidden="1" w:unhideWhenUsed="1"/>
+    <w:lsdException w:name="Note Heading" w:semiHidden="1" w:unhideWhenUsed="1"/>
+    <w:lsdException w:name="Body Text 2" w:semiHidden="1" w:unhideWhenUsed="1"/>
+    <w:lsdException w:name="Body Text 3" w:semiHidden="1" w:unhideWhenUsed="1"/>
+    <w:lsdException w:name="Body Text Indent 2" w:semiHidden="1" w:unhideWhenUsed="1"/>
+    <w:lsdException w:name="Body Text Indent 3" w:semiHidden="1" w:unhideWhenUsed="1"/>
+    <w:lsdException w:name="Block Text" w:semiHidden="1" w:unhideWhenUsed="1"/>
+    <w:lsdException w:name="Hyperlink" w:semiHidden="1" w:unhideWhenUsed="1"/>
+    <w:lsdException w:name="FollowedHyperlink" w:semiHidden="1" w:unhideWhenUsed="1"/>
+    <w:lsdException w:name="Strong" w:uiPriority="22" w:qFormat="1"/>
+    <w:lsdException w:name="Emphasis" w:uiPriority="20" w:qFormat="1"/>
+    <w:lsdException w:name="Document Map" w:semiHidden="1" w:unhideWhenUsed="1"/>
+    <w:lsdException w:name="Plain Text" w:semiHidden="1" w:unhideWhenUsed="1"/>
+    <w:lsdException w:name="E-mail Signature" w:semiHidden="1" w:unhideWhenUsed="1"/>
+    <w:lsdException w:name="HTML Top of Form" w:semiHidden="1" w:unhideWhenUsed="1"/>
+    <w:lsdException w:name="HTML Bottom of Form" w:semiHidden="1" w:unhideWhenUsed="1"/>
+    <w:lsdException w:name="Normal (Web)" w:semiHidden="1" w:unhideWhenUsed="1"/>
+    <w:lsdException w:name="HTML Acronym" w:semiHidden="1" w:unhideWhenUsed="1"/>
+    <w:lsdException w:name="HTML Address" w:semiHidden="1" w:unhideWhenUsed="1"/>
+    <w:lsdException w:name="HTML Cite" w:semiHidden="1" w:unhideWhenUsed="1"/>
+    <w:lsdException w:name="HTML Code" w:semiHidden="1" w:unhideWhenUsed="1"/>
+    <w:lsdException w:name="HTML Definition" w:semiHidden="1" w:unhideWhenUsed="1"/>
+    <w:lsdException w:name="HTML Keyboard" w:semiHidden="1" w:unhideWhenUsed="1"/>
+    <w:lsdException w:name="HTML Preformatted" w:semiHidden="1" w:unhideWhenUsed="1"/>
+    <w:lsdException w:name="HTML Sample" w:semiHidden="1" w:unhideWhenUsed="1"/>
+    <w:lsdException w:name="HTML Typewriter" w:semiHidden="1" w:unhideWhenUsed="1"/>
+    <w:lsdException w:name="HTML Variable" w:semiHidden="1" w:unhideWhenUsed="1"/>
+    <w:lsdException w:name="Normal Table" w:semiHidden="1" w:unhideWhenUsed="1"/>
+    <w:lsdException w:name="annotation subject" w:semiHidden="1" w:unhideWhenUsed="1"/>
+    <w:lsdException w:name="No List" w:semiHidden="1" w:unhideWhenUsed="1"/>
+    <w:lsdException w:name="Outline List 1" w:semiHidden="1" w:unhideWhenUsed="1"/>
+    <w:lsdException w:name="Outline List 2" w:semiHidden="1" w:unhideWhenUsed="1"/>
+    <w:lsdException w:name="Outline List 3" w:semiHidden="1" w:unhideWhenUsed="1"/>
+    <w:lsdException w:name="Table Simple 1" w:semiHidden="1" w:unhideWhenUsed="1"/>
+    <w:lsdException w:name="Table Simple 2" w:semiHidden="1" w:unhideWhenUsed="1"/>
+    <w:lsdException w:name="Table Simple 3" w:semiHidden="1" w:unhideWhenUsed="1"/>
+    <w:lsdException w:name="Table Classic 1" w:semiHidden="1" w:unhideWhenUsed="1"/>
+    <w:lsdException w:name="Table Classic 2" w:semiHidden="1" w:unhideWhenUsed="1"/>
+    <w:lsdException w:name="Table Classic 3" w:semiHidden="1" w:unhideWhenUsed="1"/>
+    <w:lsdException w:name="Table Classic 4" w:semiHidden="1" w:unhideWhenUsed="1"/>
+    <w:lsdException w:name="Table Colorful 1" w:semiHidden="1" w:unhideWhenUsed="1"/>
+    <w:lsdException w:name="Table Colorful 2" w:semiHidden="1" w:unhideWhenUsed="1"/>
+    <w:lsdException w:name="Table Colorful 3" w:semiHidden="1" w:unhideWhenUsed="1"/>
+    <w:lsdException w:name="Table Columns 1" w:semiHidden="1" w:unhideWhenUsed="1"/>
+    <w:lsdException w:name="Table Columns 2" w:semiHidden="1" w:unhideWhenUsed="1"/>
+    <w:lsdException w:name="Table Columns 3" w:semiHidden="1" w:unhideWhenUsed="1"/>
+    <w:lsdException w:name="Table Columns 4" w:semiHidden="1" w:unhideWhenUsed="1"/>
+    <w:lsdException w:name="Table Columns 5" w:semiHidden="1" w:unhideWhenUsed="1"/>
+    <w:lsdException w:name="Table Grid 1" w:semiHidden="1" w:unhideWhenUsed="1"/>
+    <w:lsdException w:name="Table Grid 2" w:semiHidden="1" w:unhideWhenUsed="1"/>
+    <w:lsdException w:name="Table Grid 3" w:semiHidden="1" w:unhideWhenUsed="1"/>
+    <w:lsdException w:name="Table Grid 4" w:semiHidden="1" w:unhideWhenUsed="1"/>
+    <w:lsdException w:name="Table Grid 5" w:semiHidden="1" w:unhideWhenUsed="1"/>
+    <w:lsdException w:name="Table Grid 6" w:semiHidden="1" w:unhideWhenUsed="1"/>
+    <w:lsdException w:name="Table Grid 7" w:semiHidden="1" w:unhideWhenUsed="1"/>
+    <w:lsdException w:name="Table Grid 8" w:semiHidden="1" w:unhideWhenUsed="1"/>
+    <w:lsdException w:name="Table List 1" w:semiHidden="1" w:unhideWhenUsed="1"/>
+    <w:lsdException w:name="Table List 2" w:semiHidden="1" w:unhideWhenUsed="1"/>
+    <w:lsdException w:name="Table List 3" w:semiHidden="1" w:unhideWhenUsed="1"/>
+    <w:lsdException w:name="Table List 4" w:semiHidden="1" w:unhideWhenUsed="1"/>
+    <w:lsdException w:name="Table List 5" w:semiHidden="1" w:unhideWhenUsed="1"/>
+    <w:lsdException w:name="Table List 6" w:semiHidden="1" w:unhideWhenUsed="1"/>
+    <w:lsdException w:name="Table List 7" w:semiHidden="1" w:unhideWhenUsed="1"/>
+    <w:lsdException w:name="Table List 8" w:semiHidden="1" w:unhideWhenUsed="1"/>
+    <w:lsdException w:name="Table 3D effects 1" w:semiHidden="1" w:unhideWhenUsed="1"/>
+    <w:lsdException w:name="Table 3D effects 2" w:semiHidden="1" w:unhideWhenUsed="1"/>
+    <w:lsdException w:name="Table 3D effects 3" w:semiHidden="1" w:unhideWhenUsed="1"/>
+    <w:lsdException w:name="Table Contemporary" w:semiHidden="1" w:unhideWhenUsed="1"/>
+    <w:lsdException w:name="Table Elegant" w:semiHidden="1" w:unhideWhenUsed="1"/>
+    <w:lsdException w:name="Table Professional" w:semiHidden="1" w:unhideWhenUsed="1"/>
+    <w:lsdException w:name="Table Subtle 1" w:semiHidden="1" w:unhideWhenUsed="1"/>
+    <w:lsdException w:name="Table Subtle 2" w:semiHidden="1" w:unhideWhenUsed="1"/>
+    <w:lsdException w:name="Table Web 1" w:semiHidden="1" w:unhideWhenUsed="1"/>
+    <w:lsdException w:name="Table Web 2" w:semiHidden="1" w:unhideWhenUsed="1"/>
+    <w:lsdException w:name="Table Web 3" w:semiHidden="1" w:unhideWhenUsed="1"/>
+    <w:lsdException w:name="Balloon Text" w:semiHidden="1" w:unhideWhenUsed="1"/>
+    <w:lsdException w:name="Table Grid" w:uiPriority="39"/>
+    <w:lsdException w:name="Table Theme" w:semiHidden="1" w:unhideWhenUsed="1"/>
+    <w:lsdException w:name="Placeholder Text" w:semiHidden="1"/>
+    <w:lsdException w:name="No Spacing" w:uiPriority="1" w:qFormat="1"/>
+    <w:lsdException w:name="Light Shading" w:uiPriority="60"/>
+    <w:lsdException w:name="Light List" w:uiPriority="61"/>
+    <w:lsdException w:name="Light Grid" w:uiPriority="62"/>
+    <w:lsdException w:name="Medium Shading 1" w:uiPriority="63"/>
+    <w:lsdException w:name="Medium Shading 2" w:uiPriority="64"/>
+    <w:lsdException w:name="Medium List 1" w:uiPriority="65"/>
+    <w:lsdException w:name="Medium List 2" w:uiPriority="66"/>
+    <w:lsdException w:name="Medium Grid 1" w:uiPriority="67"/>
+    <w:lsdException w:name="Medium Grid 2" w:uiPriority="68"/>
+    <w:lsdException w:name="Medium Grid 3" w:uiPriority="69"/>
+    <w:lsdException w:name="Dark List" w:uiPriority="70"/>
+    <w:lsdException w:name="Colorful Shading" w:uiPriority="71"/>
+    <w:lsdException w:name="Colorful List" w:uiPriority="72"/>
+    <w:lsdException w:name="Colorful Grid" w:uiPriority="73"/>
+    <w:lsdException w:name="Light Shading Accent 1" w:uiPriority="60"/>
+    <w:lsdException w:name="Light List Accent 1" w:uiPriority="61"/>
+    <w:lsdException w:name="Light Grid Accent 1" w:uiPriority="62"/>
+    <w:lsdException w:name="Medium Shading 1 Accent 1" w:uiPriority="63"/>
+    <w:lsdException w:name="Medium Shading 2 Accent 1" w:uiPriority="64"/>
+    <w:lsdException w:name="Medium List 1 Accent 1" w:uiPriority="65"/>
+    <w:lsdException w:name="Revision" w:semiHidden="1"/>
+    <w:lsdException w:name="List Paragraph" w:uiPriority="34" w:qFormat="1"/>
+    <w:lsdException w:name="Quote" w:uiPriority="29" w:qFormat="1"/>
+    <w:lsdException w:name="Intense Quote" w:uiPriority="30" w:qFormat="1"/>
+    <w:lsdException w:name="Medium List 2 Accent 1" w:uiPriority="66"/>
+    <w:lsdException w:name="Medium Grid 1 Accent 1" w:uiPriority="67"/>
+    <w:lsdException w:name="Medium Grid 2 Accent 1" w:uiPriority="68"/>
+    <w:lsdException w:name="Medium Grid 3 Accent 1" w:uiPriority="69"/>
+    <w:lsdException w:name="Dark List Accent 1" w:uiPriority="70"/>
+    <w:lsdException w:name="Colorful Shading Accent 1" w:uiPriority="71"/>
+    <w:lsdException w:name="Colorful List Accent 1" w:uiPriority="72"/>
+    <w:lsdException w:name="Colorful Grid Accent 1" w:uiPriority="73"/>
+    <w:lsdException w:name="Light Shading Accent 2" w:uiPriority="60"/>
+    <w:lsdException w:name="Light List Accent 2" w:uiPriority="61"/>
+    <w:lsdException w:name="Light Grid Accent 2" w:uiPriority="62"/>
+    <w:lsdException w:name="Medium Shading 1 Accent 2" w:uiPriority="63"/>
+    <w:lsdException w:name="Medium Shading 2 Accent 2" w:uiPriority="64"/>
+    <w:lsdException w:name="Medium List 1 Accent 2" w:uiPriority="65"/>
+    <w:lsdException w:name="Medium List 2 Accent 2" w:uiPriority="66"/>
+    <w:lsdException w:name="Medium Grid 1 Accent 2" w:uiPriority="67"/>
+    <w:lsdException w:name="Medium Grid 2 Accent 2" w:uiPriority="68"/>
+    <w:lsdException w:name="Medium Grid 3 Accent 2" w:uiPriority="69"/>
+    <w:lsdException w:name="Dark List Accent 2" w:uiPriority="70"/>
+    <w:lsdException w:name="Colorful Shading Accent 2" w:uiPriority="71"/>
+    <w:lsdException w:name="Colorful List Accent 2" w:uiPriority="72"/>
+    <w:lsdException w:name="Colorful Grid Accent 2" w:uiPriority="73"/>
+    <w:lsdException w:name="Light Shading Accent 3" w:uiPriority="60"/>
+    <w:lsdException w:name="Light List Accent 3" w:uiPriority="61"/>
+    <w:lsdException w:name="Light Grid Accent 3" w:uiPriority="62"/>
+    <w:lsdException w:name="Medium Shading 1 Accent 3" w:uiPriority="63"/>
+    <w:lsdException w:name="Medium Shading 2 Accent 3" w:uiPriority="64"/>
+    <w:lsdException w:name="Medium List 1 Accent 3" w:uiPriority="65"/>
+    <w:lsdException w:name="Medium List 2 Accent 3" w:uiPriority="66"/>
+    <w:lsdException w:name="Medium Grid 1 Accent 3" w:uiPriority="67"/>
+    <w:lsdException w:name="Medium Grid 2 Accent 3" w:uiPriority="68"/>
+    <w:lsdException w:name="Medium Grid 3 Accent 3" w:uiPriority="69"/>
+    <w:lsdException w:name="Dark List Accent 3" w:uiPriority="70"/>
+    <w:lsdException w:name="Colorful Shading Accent 3" w:uiPriority="71"/>
+    <w:lsdException w:name="Colorful List Accent 3" w:uiPriority="72"/>
+    <w:lsdException w:name="Colorful Grid Accent 3" w:uiPriority="73"/>
+    <w:lsdException w:name="Light Shading Accent 4" w:uiPriority="60"/>
+    <w:lsdException w:name="Light List Accent 4" w:uiPriority="61"/>
+    <w:lsdException w:name="Light Grid Accent 4" w:uiPriority="62"/>
+    <w:lsdException w:name="Medium Shading 1 Accent 4" w:uiPriority="63"/>
+    <w:lsdException w:name="Medium Shading 2 Accent 4" w:uiPriority="64"/>
+    <w:lsdException w:name="Medium List 1 Accent 4" w:uiPriority="65"/>
+    <w:lsdException w:name="Medium List 2 Accent 4" w:uiPriority="66"/>
+    <w:lsdException w:name="Medium Grid 1 Accent 4" w:uiPriority="67"/>
+    <w:lsdException w:name="Medium Grid 2 Accent 4" w:uiPriority="68"/>
+    <w:lsdException w:name="Medium Grid 3 Accent 4" w:uiPriority="69"/>
+    <w:lsdException w:name="Dark List Accent 4" w:uiPriority="70"/>
+    <w:lsdException w:name="Colorful Shading Accent 4" w:uiPriority="71"/>
+    <w:lsdException w:name="Colorful List Accent 4" w:uiPriority="72"/>
+    <w:lsdException w:name="Colorful Grid Accent 4" w:uiPriority="73"/>
+    <w:lsdException w:name="Light Shading Accent 5" w:uiPriority="60"/>
+    <w:lsdException w:name="Light List Accent 5" w:uiPriority="61"/>
+    <w:lsdException w:name="Light Grid Accent 5" w:uiPriority="62"/>
+    <w:lsdException w:name="Medium Shading 1 Accent 5" w:uiPriority="63"/>
+    <w:lsdException w:name="Medium Shading 2 Accent 5" w:uiPriority="64"/>
+    <w:lsdException w:name="Medium List 1 Accent 5" w:uiPriority="65"/>
+    <w:lsdException w:name="Medium List 2 Accent 5" w:uiPriority="66"/>
+    <w:lsdException w:name="Medium Grid 1 Accent 5" w:uiPriority="67"/>
+    <w:lsdException w:name="Medium Grid 2 Accent 5" w:uiPriority="68"/>
+    <w:lsdException w:name="Medium Grid 3 Accent 5" w:uiPriority="69"/>
+    <w:lsdException w:name="Dark List Accent 5" w:uiPriority="70"/>
+    <w:lsdException w:name="Colorful Shading Accent 5" w:uiPriority="71"/>
+    <w:lsdException w:name="Colorful List Accent 5" w:uiPriority="72"/>
+    <w:lsdException w:name="Colorful Grid Accent 5" w:uiPriority="73"/>
+    <w:lsdException w:name="Light Shading Accent 6" w:uiPriority="60"/>
+    <w:lsdException w:name="Light List Accent 6" w:uiPriority="61"/>
+    <w:lsdException w:name="Light Grid Accent 6" w:uiPriority="62"/>
+    <w:lsdException w:name="Medium Shading 1 Accent 6" w:uiPriority="63"/>
+    <w:lsdException w:name="Medium Shading 2 Accent 6" w:uiPriority="64"/>
+    <w:lsdException w:name="Medium List 1 Accent 6" w:uiPriority="65"/>
+    <w:lsdException w:name="Medium List 2 Accent 6" w:uiPriority="66"/>
+    <w:lsdException w:name="Medium Grid 1 Accent 6" w:uiPriority="67"/>
+    <w:lsdException w:name="Medium Grid 2 Accent 6" w:uiPriority="68"/>
+    <w:lsdException w:name="Medium Grid 3 Accent 6" w:uiPriority="69"/>
+    <w:lsdException w:name="Dark List Accent 6" w:uiPriority="70"/>
+    <w:lsdException w:name="Colorful Shading Accent 6" w:uiPriority="71"/>
+    <w:lsdException w:name="Colorful List Accent 6" w:uiPriority="72"/>
+    <w:lsdException w:name="Colorful Grid Accent 6" w:uiPriority="73"/>
+    <w:lsdException w:name="Subtle Emphasis" w:uiPriority="19" w:qFormat="1"/>
+    <w:lsdException w:name="Intense Emphasis" w:uiPriority="21" w:qFormat="1"/>
+    <w:lsdException w:name="Subtle Reference" w:uiPriority="31" w:qFormat="1"/>
+    <w:lsdException w:name="Intense Reference" w:uiPriority="32" w:qFormat="1"/>
+    <w:lsdException w:name="Book Title" w:uiPriority="33" w:qFormat="1"/>
+    <w:lsdException w:name="Bibliography" w:semiHidden="1" w:uiPriority="37" w:unhideWhenUsed="1"/>
+    <w:lsdException w:name="TOC Heading" w:semiHidden="1" w:uiPriority="39" w:unhideWhenUsed="1" w:qFormat="1"/>
+    <w:lsdException w:name="Plain Table 1" w:uiPriority="41"/>
+    <w:lsdException w:name="Plain Table 2" w:uiPriority="42"/>
+    <w:lsdException w:name="Plain Table 3" w:uiPriority="43"/>
+    <w:lsdException w:name="Plain Table 4" w:uiPriority="44"/>
+    <w:lsdException w:name="Plain Table 5" w:uiPriority="45"/>
+    <w:lsdException w:name="Grid Table Light" w:uiPriority="40"/>
+    <w:lsdException w:name="Grid Table 1 Light" w:uiPriority="46"/>
+    <w:lsdException w:name="Grid Table 2" w:uiPriority="47"/>
+    <w:lsdException w:name="Grid Table 3" w:uiPriority="48"/>
+    <w:lsdException w:name="Grid Table 4" w:uiPriority="49"/>
+    <w:lsdException w:name="Grid Table 5 Dark" w:uiPriority="50"/>
+    <w:lsdException w:name="Grid Table 6 Colorful" w:uiPriority="51"/>
+    <w:lsdException w:name="Grid Table 7 Colorful" w:uiPriority="52"/>
+    <w:lsdException w:name="Grid Table 1 Light Accent 1" w:uiPriority="46"/>
+    <w:lsdException w:name="Grid Table 2 Accent 1" w:uiPriority="47"/>
+    <w:lsdException w:name="Grid Table 3 Accent 1" w:uiPriority="48"/>
+    <w:lsdException w:name="Grid Table 4 Accent 1" w:uiPriority="49"/>
+    <w:lsdException w:name="Grid Table 5 Dark Accent 1" w:uiPriority="50"/>
+    <w:lsdException w:name="Grid Table 6 Colorful Accent 1" w:uiPriority="51"/>
+    <w:lsdException w:name="Grid Table 7 Colorful Accent 1" w:uiPriority="52"/>
+    <w:lsdException w:name="Grid Table 1 Light Accent 2" w:uiPriority="46"/>
+    <w:lsdException w:name="Grid Table 2 Accent 2" w:uiPriority="47"/>
+    <w:lsdException w:name="Grid Table 3 Accent 2" w:uiPriority="48"/>
+    <w:lsdException w:name="Grid Table 4 Accent 2" w:uiPriority="49"/>
+    <w:lsdException w:name="Grid Table 5 Dark Accent 2" w:uiPriority="50"/>
+    <w:lsdException w:name="Grid Table 6 Colorful Accent 2" w:uiPriority="51"/>
+    <w:lsdException w:name="Grid Table 7 Colorful Accent 2" w:uiPriority="52"/>
+    <w:lsdException w:name="Grid Table 1 Light Accent 3" w:uiPriority="46"/>
+    <w:lsdException w:name="Grid Table 2 Accent 3" w:uiPriority="47"/>
+    <w:lsdException w:name="Grid Table 3 Accent 3" w:uiPriority="48"/>
+    <w:lsdException w:name="Grid Table 4 Accent 3" w:uiPriority="49"/>
+    <w:lsdException w:name="Grid Table 5 Dark Accent 3" w:uiPriority="50"/>
+    <w:lsdException w:name="Grid Table 6 Colorful Accent 3" w:uiPriority="51"/>
+    <w:lsdException w:name="Grid Table 7 Colorful Accent 3" w:uiPriority="52"/>
+    <w:lsdException w:name="Grid Table 1 Light Accent 4" w:uiPriority="46"/>
+    <w:lsdException w:name="Grid Table 2 Accent 4" w:uiPriority="47"/>
+    <w:lsdException w:name="Grid Table 3 Accent 4" w:uiPriority="48"/>
+    <w:lsdException w:name="Grid Table 4 Accent 4" w:uiPriority="49"/>
+    <w:lsdException w:name="Grid Table 5 Dark Accent 4" w:uiPriority="50"/>
+    <w:lsdException w:name="Grid Table 6 Colorful Accent 4" w:uiPriority="51"/>
+    <w:lsdException w:name="Grid Table 7 Colorful Accent 4" w:uiPriority="52"/>
+    <w:lsdException w:name="Grid Table 1 Light Accent 5" w:uiPriority="46"/>
+    <w:lsdException w:name="Grid Table 2 Accent 5" w:uiPriority="47"/>
+    <w:lsdException w:name="Grid Table 3 Accent 5" w:uiPriority="48"/>
+    <w:lsdException w:name="Grid Table 4 Accent 5" w:uiPriority="49"/>
+    <w:lsdException w:name="Grid Table 5 Dark Accent 5" w:uiPriority="50"/>
+    <w:lsdException w:name="Grid Table 6 Colorful Accent 5" w:uiPriority="51"/>
+    <w:lsdException w:name="Grid Table 7 Colorful Accent 5" w:uiPriority="52"/>
+    <w:lsdException w:name="Grid Table 1 Light Accent 6" w:uiPriority="46"/>
+    <w:lsdException w:name="Grid Table 2 Accent 6" w:uiPriority="47"/>
+    <w:lsdException w:name="Grid Table 3 Accent 6" w:uiPriority="48"/>
+    <w:lsdException w:name="Grid Table 4 Accent 6" w:uiPriority="49"/>
+    <w:lsdException w:name="Grid Table 5 Dark Accent 6" w:uiPriority="50"/>
+    <w:lsdException w:name="Grid Table 6 Colorful Accent 6" w:uiPriority="51"/>
+    <w:lsdException w:name="Grid Table 7 Colorful Accent 6" w:uiPriority="52"/>
+    <w:lsdException w:name="List Table 1 Light" w:uiPriority="46"/>
+    <w:lsdException w:name="List Table 2" w:uiPriority="47"/>
+    <w:lsdException w:name="List Table 3" w:uiPriority="48"/>
+    <w:lsdException w:name="List Table 4" w:uiPriority="49"/>
+    <w:lsdException w:name="List Table 5 Dark" w:uiPriority="50"/>
+    <w:lsdException w:name="List Table 6 Colorful" w:uiPriority="51"/>
+    <w:lsdException w:name="List Table 7 Colorful" w:uiPriority="52"/>
+    <w:lsdException w:name="List Table 1 Light Accent 1" w:uiPriority="46"/>
+    <w:lsdException w:name="List Table 2 Accent 1" w:uiPriority="47"/>
+    <w:lsdException w:name="List Table 3 Accent 1" w:uiPriority="48"/>
+    <w:lsdException w:name="List Table 4 Accent 1" w:uiPriority="49"/>
+    <w:lsdException w:name="List Table 5 Dark Accent 1" w:uiPriority="50"/>
+    <w:lsdException w:name="List Table 6 Colorful Accent 1" w:uiPriority="51"/>
+    <w:lsdException w:name="List Table 7 Colorful Accent 1" w:uiPriority="52"/>
+    <w:lsdException w:name="List Table 1 Light Accent 2" w:uiPriority="46"/>
+    <w:lsdException w:name="List Table 2 Accent 2" w:uiPriority="47"/>
+    <w:lsdException w:name="List Table 3 Accent 2" w:uiPriority="48"/>
+    <w:lsdException w:name="List Table 4 Accent 2" w:uiPriority="49"/>
+    <w:lsdException w:name="List Table 5 Dark Accent 2" w:uiPriority="50"/>
+    <w:lsdException w:name="List Table 6 Colorful Accent 2" w:uiPriority="51"/>
+    <w:lsdException w:name="List Table 7 Colorful Accent 2" w:uiPriority="52"/>
+    <w:lsdException w:name="List Table 1 Light Accent 3" w:uiPriority="46"/>
+    <w:lsdException w:name="List Table 2 Accent 3" w:uiPriority="47"/>
+    <w:lsdException w:name="List Table 3 Accent 3" w:uiPriority="48"/>
+    <w:lsdException w:name="List Table 4 Accent 3" w:uiPriority="49"/>
+    <w:lsdException w:name="List Table 5 Dark Accent 3" w:uiPriority="50"/>
+    <w:lsdException w:name="List Table 6 Colorful Accent 3" w:uiPriority="51"/>
+    <w:lsdException w:name="List Table 7 Colorful Accent 3" w:uiPriority="52"/>
+    <w:lsdException w:name="List Table 1 Light Accent 4" w:uiPriority="46"/>
+    <w:lsdException w:name="List Table 2 Accent 4" w:uiPriority="47"/>
+    <w:lsdException w:name="List Table 3 Accent 4" w:uiPriority="48"/>
+    <w:lsdException w:name="List Table 4 Accent 4" w:uiPriority="49"/>
+    <w:lsdException w:name="List Table 5 Dark Accent 4" w:uiPriority="50"/>
+    <w:lsdException w:name="List Table 6 Colorful Accent 4" w:uiPriority="51"/>
+    <w:lsdException w:name="List Table 7 Colorful Accent 4" w:uiPriority="52"/>
+    <w:lsdException w:name="List Table 1 Light Accent 5" w:uiPriority="46"/>
+    <w:lsdException w:name="List Table 2 Accent 5" w:uiPriority="47"/>
+    <w:lsdException w:name="List Table 3 Accent 5" w:uiPriority="48"/>
+    <w:lsdException w:name="List Table 4 Accent 5" w:uiPriority="49"/>
+    <w:lsdException w:name="List Table 5 Dark Accent 5" w:uiPriority="50"/>
+    <w:lsdException w:name="List Table 6 Colorful Accent 5" w:uiPriority="51"/>
+    <w:lsdException w:name="List Table 7 Colorful Accent 5" w:uiPriority="52"/>
+    <w:lsdException w:name="List Table 1 Light Accent 6" w:uiPriority="46"/>
+    <w:lsdException w:name="List Table 2 Accent 6" w:uiPriority="47"/>
+    <w:lsdException w:name="List Table 3 Accent 6" w:uiPriority="48"/>
+    <w:lsdException w:name="List Table 4 Accent 6" w:uiPriority="49"/>
+    <w:lsdException w:name="List Table 5 Dark Accent 6" w:uiPriority="50"/>
+    <w:lsdException w:name="List Table 6 Colorful Accent 6" w:uiPriority="51"/>
+    <w:lsdException w:name="List Table 7 Colorful Accent 6" w:uiPriority="52"/>
+    <w:lsdException w:name="Mention" w:semiHidden="1" w:unhideWhenUsed="1"/>
+    <w:lsdException w:name="Smart Hyperlink" w:semiHidden="1" w:unhideWhenUsed="1"/>
+    <w:lsdException w:name="Hashtag" w:semiHidden="1" w:unhideWhenUsed="1"/>
+    <w:lsdException w:name="Unresolved Mention" w:semiHidden="1" w:unhideWhenUsed="1"/>
+    <w:lsdException w:name="Smart Link" w:semiHidden="1" w:unhideWhenUsed="1"/>
+  </w:latentStyles>
+  <w:style w:type="paragraph" w:default="1" w:styleId="Normal">
+    <w:name w:val="Normal"/>
+    <w:qFormat/>
+    <w:rPr>
+      <w:rFonts w:ascii="Arial" w:eastAsia="Arial" w:hAnsi="Arial" w:cs="Arial"/>
+    </w:rPr>
+  </w:style>
+  <w:style w:type="paragraph" w:styleId="Heading1">
+    <w:name w:val="heading 1"/>
+    <w:basedOn w:val="Normal"/>
+    <w:uiPriority w:val="9"/>
+    <w:qFormat/>
+    <w:pPr>
+      <w:spacing w:before="21"/>
+      <w:ind w:left="20"/>
+      <w:outlineLvl w:val="0"/>
+    </w:pPr>
+    <w:rPr>
+      <w:b/>
+      <w:bCs/>
+    </w:rPr>
+  </w:style>
+  <w:style w:type="character" w:default="1" w:styleId="DefaultParagraphFont">
     <w:name w:val="Default Paragraph Font"/>
     <w:uiPriority w:val="1"/>
     <w:semiHidden/>
     <w:unhideWhenUsed/>
   </w:style>
-  <w:style w:styleId="TableNormal" w:default="1" w:type="table">
-    <w:name w:val="Table Normal"/>
-    <w:uiPriority w:val="2"/>
+  <w:style w:type="table" w:default="1" w:styleId="TableNormal">
+    <w:name w:val="Normal Table"/>
+    <w:uiPriority w:val="99"/>
     <w:semiHidden/>
     <w:unhideWhenUsed/>
-    <w:qFormat/>
     <w:tblPr>
       <w:tblInd w:w="0" w:type="dxa"/>
       <w:tblCellMar>
         <w:top w:w="0" w:type="dxa"/>
-        <w:left w:w="0" w:type="dxa"/>
+        <w:left w:w="108" w:type="dxa"/>
         <w:bottom w:w="0" w:type="dxa"/>
-        <w:right w:w="0" w:type="dxa"/>
+        <w:right w:w="108" w:type="dxa"/>
       </w:tblCellMar>
     </w:tblPr>
   </w:style>
-  <w:style w:styleId="NoList" w:default="1" w:type="numbering">
+  <w:style w:type="numbering" w:default="1" w:styleId="NoList">
     <w:name w:val="No List"/>
     <w:uiPriority w:val="99"/>
     <w:semiHidden/>
     <w:unhideWhenUsed/>
   </w:style>
-  <w:style w:default="1" w:styleId="Normal" w:type="paragraph">
-    <w:name w:val="Normal"/>
-    <w:uiPriority w:val="1"/>
-    <w:qFormat/>
-    <w:pPr/>
-    <w:rPr>
-      <w:rFonts w:ascii="Arial" w:hAnsi="Arial" w:eastAsia="Arial" w:cs="Arial"/>
-      <w:lang w:val="en-US" w:eastAsia="en-US" w:bidi="ar-SA"/>
-    </w:rPr>
-  </w:style>
-  <w:style w:styleId="BodyText" w:type="paragraph">
+  <w:style w:type="paragraph" w:styleId="BodyText">
     <w:name w:val="Body Text"/>
     <w:basedOn w:val="Normal"/>
     <w:uiPriority w:val="1"/>
     <w:qFormat/>
-    <w:pPr/>
-    <w:rPr>
-      <w:rFonts w:ascii="Arial" w:hAnsi="Arial" w:eastAsia="Arial" w:cs="Arial"/>
-      <w:sz w:val="22"/>
-      <w:szCs w:val="22"/>
-      <w:lang w:val="en-US" w:eastAsia="en-US" w:bidi="ar-SA"/>
-    </w:rPr>
   </w:style>
-  <w:style w:styleId="Heading1" w:type="paragraph">
-    <w:name w:val="Heading 1"/>
-    <w:basedOn w:val="Normal"/>
-    <w:uiPriority w:val="1"/>
-    <w:qFormat/>
-    <w:pPr>
-      <w:spacing w:before="21"/>
-      <w:ind w:left="20"/>
-      <w:outlineLvl w:val="1"/>
-    </w:pPr>
-    <w:rPr>
-      <w:rFonts w:ascii="Arial" w:hAnsi="Arial" w:eastAsia="Arial" w:cs="Arial"/>
-      <w:b/>
-      <w:bCs/>
-      <w:sz w:val="22"/>
-      <w:szCs w:val="22"/>
-      <w:lang w:val="en-US" w:eastAsia="en-US" w:bidi="ar-SA"/>
-    </w:rPr>
-  </w:style>
-  <w:style w:styleId="ListParagraph" w:type="paragraph">
+  <w:style w:type="paragraph" w:styleId="ListParagraph">
     <w:name w:val="List Paragraph"/>
     <w:basedOn w:val="Normal"/>
     <w:uiPriority w:val="1"/>
@@ -3320,12 +3114,8 @@
       <w:ind w:left="1244" w:right="767" w:hanging="360"/>
       <w:jc w:val="both"/>
     </w:pPr>
-    <w:rPr>
-      <w:rFonts w:ascii="Arial" w:hAnsi="Arial" w:eastAsia="Arial" w:cs="Arial"/>
-      <w:lang w:val="en-US" w:eastAsia="en-US" w:bidi="ar-SA"/>
-    </w:rPr>
   </w:style>
-  <w:style w:styleId="TableParagraph" w:type="paragraph">
+  <w:style w:type="paragraph" w:customStyle="1" w:styleId="TableParagraph">
     <w:name w:val="Table Paragraph"/>
     <w:basedOn w:val="Normal"/>
     <w:uiPriority w:val="1"/>
@@ -3333,10 +3123,6 @@
     <w:pPr>
       <w:jc w:val="center"/>
     </w:pPr>
-    <w:rPr>
-      <w:rFonts w:ascii="Arial" w:hAnsi="Arial" w:eastAsia="Arial" w:cs="Arial"/>
-      <w:lang w:val="en-US" w:eastAsia="en-US" w:bidi="ar-SA"/>
-    </w:rPr>
   </w:style>
 </w:styles>
 </file>

</xml_diff>